<commit_message>
feat: unificar previsualizacion actaPrint con clases oficiais da plantilla Word para paridade 1:1:1
</commit_message>
<xml_diff>
--- a/ejemplo_modificado_acta_semanal.docx
+++ b/ejemplo_modificado_acta_semanal.docx
@@ -42,12 +42,15 @@
             <w:pPr>
               <w:spacing w:before="0" w:after="0"/>
               <w:ind w:left="107"/>
+              <w:rPr>
+                <w:szCs w:val="20"/>
+              </w:rPr>
             </w:pPr>
             <w:proofErr w:type="spellStart"/>
             <w:r>
               <w:rPr>
                 <w:color w:val="64748B"/>
-                <w:sz w:val="17"/>
+                <w:szCs w:val="20"/>
               </w:rPr>
               <w:t>Proxecto</w:t>
             </w:r>
@@ -55,14 +58,14 @@
             <w:r>
               <w:rPr>
                 <w:color w:val="64748B"/>
-                <w:sz w:val="17"/>
+                <w:szCs w:val="20"/>
               </w:rPr>
               <w:t xml:space="preserve">: </w:t>
             </w:r>
             <w:r>
               <w:rPr>
                 <w:b/>
-                <w:sz w:val="17"/>
+                <w:szCs w:val="20"/>
               </w:rPr>
               <w:t xml:space="preserve">Refundido de actuaciones en el castillo de San Felipe, en el marco del plan de recuperación, transformación y resiliencia –financiado por la Unión Europea – Next </w:t>
             </w:r>
@@ -70,7 +73,7 @@
             <w:r>
               <w:rPr>
                 <w:b/>
-                <w:sz w:val="17"/>
+                <w:szCs w:val="20"/>
               </w:rPr>
               <w:t>Generation</w:t>
             </w:r>
@@ -78,7 +81,7 @@
             <w:r>
               <w:rPr>
                 <w:b/>
-                <w:sz w:val="17"/>
+                <w:szCs w:val="20"/>
               </w:rPr>
               <w:t xml:space="preserve"> EU</w:t>
             </w:r>
@@ -102,18 +105,21 @@
             <w:pPr>
               <w:spacing w:before="0" w:after="0"/>
               <w:ind w:left="107"/>
+              <w:rPr>
+                <w:szCs w:val="20"/>
+              </w:rPr>
             </w:pPr>
             <w:r>
               <w:rPr>
                 <w:color w:val="64748B"/>
-                <w:sz w:val="17"/>
+                <w:szCs w:val="20"/>
               </w:rPr>
               <w:t xml:space="preserve">Data da visita: </w:t>
             </w:r>
             <w:r>
               <w:rPr>
                 <w:b/>
-                <w:sz w:val="17"/>
+                <w:szCs w:val="20"/>
               </w:rPr>
               <w:t>09/09/2025</w:t>
             </w:r>
@@ -142,17 +148,20 @@
             <w:pPr>
               <w:spacing w:before="0" w:after="0"/>
               <w:ind w:left="107"/>
+              <w:rPr>
+                <w:szCs w:val="20"/>
+              </w:rPr>
             </w:pPr>
             <w:r>
               <w:rPr>
                 <w:color w:val="64748B"/>
-                <w:sz w:val="17"/>
+                <w:szCs w:val="20"/>
               </w:rPr>
               <w:t xml:space="preserve">Emprazamento: </w:t>
             </w:r>
             <w:r>
               <w:rPr>
-                <w:sz w:val="17"/>
+                <w:szCs w:val="20"/>
               </w:rPr>
               <w:t>Castillo de San Felipe, 15591. Concello de Ferrol</w:t>
             </w:r>
@@ -176,18 +185,21 @@
             <w:pPr>
               <w:spacing w:before="0" w:after="0"/>
               <w:ind w:left="107"/>
+              <w:rPr>
+                <w:szCs w:val="20"/>
+              </w:rPr>
             </w:pPr>
             <w:r>
               <w:rPr>
                 <w:color w:val="64748B"/>
-                <w:sz w:val="17"/>
+                <w:szCs w:val="20"/>
               </w:rPr>
               <w:t xml:space="preserve">Expediente nº: </w:t>
             </w:r>
             <w:r>
               <w:rPr>
                 <w:b/>
-                <w:sz w:val="17"/>
+                <w:szCs w:val="20"/>
               </w:rPr>
               <w:t>AVS 03007 25/05</w:t>
             </w:r>
@@ -216,18 +228,21 @@
             <w:pPr>
               <w:spacing w:before="0" w:after="0"/>
               <w:ind w:left="107"/>
+              <w:rPr>
+                <w:szCs w:val="20"/>
+              </w:rPr>
             </w:pPr>
             <w:r>
               <w:rPr>
                 <w:color w:val="64748B"/>
-                <w:sz w:val="17"/>
+                <w:szCs w:val="20"/>
               </w:rPr>
               <w:t xml:space="preserve">Contratista: </w:t>
             </w:r>
             <w:r>
               <w:rPr>
                 <w:b/>
-                <w:sz w:val="17"/>
+                <w:szCs w:val="20"/>
               </w:rPr>
               <w:t>—</w:t>
             </w:r>
@@ -251,17 +266,20 @@
             <w:pPr>
               <w:spacing w:before="0" w:after="0"/>
               <w:ind w:left="107"/>
+              <w:rPr>
+                <w:szCs w:val="20"/>
+              </w:rPr>
             </w:pPr>
             <w:r>
               <w:rPr>
                 <w:color w:val="64748B"/>
-                <w:sz w:val="17"/>
+                <w:szCs w:val="20"/>
               </w:rPr>
               <w:t xml:space="preserve">Estado da acta: </w:t>
             </w:r>
             <w:r>
               <w:rPr>
-                <w:sz w:val="17"/>
+                <w:szCs w:val="20"/>
               </w:rPr>
               <w:t>○ Borrador</w:t>
             </w:r>
@@ -290,11 +308,14 @@
             <w:pPr>
               <w:spacing w:before="0" w:after="0"/>
               <w:ind w:left="107"/>
+              <w:rPr>
+                <w:szCs w:val="20"/>
+              </w:rPr>
             </w:pPr>
             <w:r>
               <w:rPr>
                 <w:color w:val="64748B"/>
-                <w:sz w:val="17"/>
+                <w:szCs w:val="20"/>
               </w:rPr>
               <w:t xml:space="preserve">Dirección de obra: </w:t>
             </w:r>
@@ -302,7 +323,7 @@
               <w:rPr>
                 <w:b/>
                 <w:color w:val="1E3A8A"/>
-                <w:sz w:val="17"/>
+                <w:szCs w:val="20"/>
               </w:rPr>
               <w:t>Rosa Vilas Romalde y Sergio Beceiro Lodeiro (DO)</w:t>
             </w:r>
@@ -326,11 +347,14 @@
             <w:pPr>
               <w:spacing w:before="0" w:after="0"/>
               <w:ind w:left="107"/>
+              <w:rPr>
+                <w:szCs w:val="20"/>
+              </w:rPr>
             </w:pPr>
             <w:r>
               <w:rPr>
                 <w:color w:val="64748B"/>
-                <w:sz w:val="17"/>
+                <w:szCs w:val="20"/>
               </w:rPr>
               <w:t xml:space="preserve">Dirección de execución: </w:t>
             </w:r>
@@ -338,7 +362,7 @@
               <w:rPr>
                 <w:b/>
                 <w:color w:val="0284C7"/>
-                <w:sz w:val="17"/>
+                <w:szCs w:val="20"/>
               </w:rPr>
               <w:t>Ana Gallego Núñez (DEM)</w:t>
             </w:r>
@@ -367,17 +391,20 @@
             <w:pPr>
               <w:spacing w:before="0" w:after="0"/>
               <w:ind w:left="107"/>
+              <w:rPr>
+                <w:szCs w:val="20"/>
+              </w:rPr>
             </w:pPr>
             <w:r>
               <w:rPr>
                 <w:color w:val="64748B"/>
-                <w:sz w:val="17"/>
+                <w:szCs w:val="20"/>
               </w:rPr>
               <w:t xml:space="preserve">Coordinador CSS: </w:t>
             </w:r>
             <w:r>
               <w:rPr>
-                <w:sz w:val="17"/>
+                <w:szCs w:val="20"/>
               </w:rPr>
               <w:t>Juan Carlos Bello Criado (CSS)</w:t>
             </w:r>
@@ -401,17 +428,20 @@
             <w:pPr>
               <w:spacing w:before="0" w:after="0"/>
               <w:ind w:left="107"/>
+              <w:rPr>
+                <w:szCs w:val="20"/>
+              </w:rPr>
             </w:pPr>
             <w:r>
               <w:rPr>
                 <w:color w:val="64748B"/>
-                <w:sz w:val="17"/>
+                <w:szCs w:val="20"/>
               </w:rPr>
               <w:t xml:space="preserve">Xefe de Obra: </w:t>
             </w:r>
             <w:r>
               <w:rPr>
-                <w:sz w:val="17"/>
+                <w:szCs w:val="20"/>
               </w:rPr>
               <w:t>Miguel López Rodríguez</w:t>
             </w:r>
@@ -792,130 +822,146 @@
       </w:r>
     </w:p>
     <w:p>
-      <w:r>
-        <w:rPr>
-          <w:b/>
-          <w:sz w:val="18"/>
-        </w:rPr>
+      <w:pPr>
+        <w:pStyle w:val="Ttulo3"/>
+      </w:pPr>
+      <w:r>
         <w:t>Carpinterías</w:t>
       </w:r>
     </w:p>
     <w:p>
+      <w:r>
+        <w:t>Se recibe en obra, muestra de hoja de carpintería exterior en iroko y con marco normalizado. Se solicita y se enviará por parte de la empresa de carpintería, los detalles de los marcos, documentación de calidad, ensayos y características técnicas de todos los componentes (marco, vidrio, herrajes, tratamientos, etc</w:t>
+      </w:r>
+      <w:proofErr w:type="gramStart"/>
+      <w:r>
+        <w:t>).Se</w:t>
+      </w:r>
+      <w:proofErr w:type="gramEnd"/>
+      <w:r>
+        <w:t xml:space="preserve"> toman medidas de las mochetas para ajustar los marcos de </w:t>
+      </w:r>
+      <w:proofErr w:type="gramStart"/>
+      <w:r>
+        <w:t>carpintería.La</w:t>
+      </w:r>
+      <w:proofErr w:type="gramEnd"/>
+      <w:r>
+        <w:t xml:space="preserve"> carpintería exterior será color marrón igual al existente en la torre del s. XIX.</w:t>
+      </w:r>
+    </w:p>
+    <w:p>
       <w:pPr>
-        <w:ind w:left="288"/>
+        <w:pStyle w:val="Ttulo3"/>
       </w:pPr>
       <w:r>
-        <w:rPr>
-          <w:sz w:val="17"/>
-        </w:rPr>
-        <w:t>Se recibe en obra, muestra de hoja de carpintería exterior en iroko y con marco normalizado. Se solicita y se enviará por parte de la empresa de carpintería, los detalles de los marcos, documentación de calidad, ensayos y características técnicas de todos los componentes (marco, vidrio, herrajes, tratamientos, etc).Se toman medidas de las mochetas para ajustar los marcos de carpintería.La carpintería exterior será color marrón igual al existente en la torre del s. XIX.</w:t>
-      </w:r>
-    </w:p>
-    <w:p>
-      <w:r>
-        <w:rPr>
-          <w:b/>
-          <w:sz w:val="18"/>
-        </w:rPr>
         <w:t>Sala pequeña de cafetería bloque C derecho</w:t>
       </w:r>
     </w:p>
     <w:p>
+      <w:r>
+        <w:t xml:space="preserve">Después del picado del enfoscado de mortero de cemento de la parte alta aparece el trabatel original, se solicita a la empresa constructora el levantamiento de una platilla </w:t>
+      </w:r>
+      <w:proofErr w:type="gramStart"/>
+      <w:r>
+        <w:t>del mismo</w:t>
+      </w:r>
+      <w:proofErr w:type="gramEnd"/>
+      <w:r>
+        <w:t xml:space="preserve"> y se solicita que se continue retirando los morteros de cemento para su </w:t>
+      </w:r>
+      <w:proofErr w:type="gramStart"/>
+      <w:r>
+        <w:t>recuperación.Se</w:t>
+      </w:r>
+      <w:proofErr w:type="gramEnd"/>
+      <w:r>
+        <w:t xml:space="preserve"> sacarán las líneas de replanteo de la </w:t>
+      </w:r>
+      <w:proofErr w:type="gramStart"/>
+      <w:r>
+        <w:t>cubierta.Se</w:t>
+      </w:r>
+      <w:proofErr w:type="gramEnd"/>
+      <w:r>
+        <w:t xml:space="preserve"> recibe valoración en cuanto a medición del desmontado de la parte superior del muro de fachada que se encuentra muy desplomado. Se aprueba y se medirá en las partidas 3.2.8 de desmontaje y la partida 4.1.3 de realización de muro.</w:t>
+      </w:r>
+    </w:p>
+    <w:p>
       <w:pPr>
-        <w:ind w:left="288"/>
+        <w:pStyle w:val="Ttulo3"/>
       </w:pPr>
       <w:r>
-        <w:rPr>
-          <w:sz w:val="17"/>
-        </w:rPr>
-        <w:t>Después del picado del enfoscado de mortero de cemento de la parte alta aparece el trabatel original, se solicita a la empresa constructora el levantamiento de una platilla del mismo y se solicita que se continue retirando los morteros de cemento para su recuperación.Se sacarán las líneas de replanteo de la cubierta.Se recibe valoración en cuanto a medición del desmontado de la parte superior del muro de fachada que se encuentra muy desplomado. Se aprueba y se medirá en las partidas 3.2.8 de desmontaje y la partida 4.1.3 de realización de muro.</w:t>
-      </w:r>
-    </w:p>
-    <w:p>
-      <w:r>
-        <w:rPr>
-          <w:b/>
-          <w:sz w:val="18"/>
-        </w:rPr>
         <w:t>En el bloque central</w:t>
       </w:r>
     </w:p>
     <w:p>
+      <w:r>
+        <w:t xml:space="preserve">Para el </w:t>
+      </w:r>
+      <w:proofErr w:type="spellStart"/>
+      <w:r>
+        <w:t>caviti</w:t>
+      </w:r>
+      <w:proofErr w:type="spellEnd"/>
+      <w:r>
+        <w:t>, se recibe ficha técnica de caviti “Granchio”. Se comprueba que las resistencias son adecuadas.</w:t>
+      </w:r>
+    </w:p>
+    <w:p>
       <w:pPr>
-        <w:ind w:left="288"/>
+        <w:pStyle w:val="Ttulo3"/>
       </w:pPr>
       <w:r>
-        <w:rPr>
-          <w:sz w:val="17"/>
-        </w:rPr>
-        <w:t>Para el caviti, se recibe ficha técnica de caviti “Granchio”. Se comprueba que las resistencias son adecuadas.</w:t>
-      </w:r>
-    </w:p>
-    <w:p>
-      <w:r>
-        <w:rPr>
-          <w:b/>
-          <w:sz w:val="18"/>
-        </w:rPr>
+        <w:lastRenderedPageBreak/>
         <w:t>En el bloque derecho de cafetería</w:t>
       </w:r>
     </w:p>
     <w:p>
+      <w:r>
+        <w:t xml:space="preserve">En zona de </w:t>
+      </w:r>
+      <w:proofErr w:type="spellStart"/>
+      <w:r>
+        <w:t>lareira</w:t>
+      </w:r>
+      <w:proofErr w:type="spellEnd"/>
+      <w:r>
+        <w:t>, se encintará la piedra de cantería y se enfoscará el resto. La DF marcará exactamente que piedras a encintar.</w:t>
+      </w:r>
+    </w:p>
+    <w:p>
       <w:pPr>
-        <w:ind w:left="288"/>
+        <w:pStyle w:val="Ttulo3"/>
       </w:pPr>
       <w:r>
-        <w:rPr>
-          <w:sz w:val="17"/>
-        </w:rPr>
-        <w:t>En zona de lareira, se encintará la piedra de cantería y se enfoscará el resto. La DF marcará exactamente que piedras a encintar.</w:t>
-      </w:r>
-    </w:p>
-    <w:p>
-      <w:r>
-        <w:rPr>
-          <w:b/>
-          <w:sz w:val="18"/>
-        </w:rPr>
         <w:t>En zona exterior</w:t>
       </w:r>
     </w:p>
     <w:p>
+      <w:r>
+        <w:t>Se solicita plano de fabricación y despiece de barandilla. Los tramos de la barandilla (modulados a 2,31 m) se traerán dependiendo del tamaño de la cuba de galvanizado y del transporte. No obstante, se solicita de nuevo un plano en cad de la empresa metálica asignada para ser aprobado por la DF antes de su fabricación.Se nos indica que esta semana se replantearán las vigas de cubierta, por parte de los carpinteros contratados, para empezar con su fabricación y comenzar con su colocación en octubre.La DF solicita cuanto antes la contratación de los trabajos de cantería. Igualmente, solicita de nuevo se agilicen los trabajos de subcontratación de los distintos oficios a la mayor brevedad posible.En esta reunión, estuvo presente el carpintero subcontratado para las obras, al que se le enviará el plano con los ajustes de la cubierta en obra y a él se le ha pedido las siguientes muestras de:  - Perfil de la carpintería exterior.  - Pavimento de tarima.  - Las divisiones de los aseos.</w:t>
+      </w:r>
+    </w:p>
+    <w:p>
       <w:pPr>
-        <w:ind w:left="288"/>
+        <w:pStyle w:val="Ttulo3"/>
       </w:pPr>
       <w:r>
-        <w:rPr>
-          <w:sz w:val="17"/>
-        </w:rPr>
-        <w:t xml:space="preserve">Se solicita plano de fabricación y despiece de barandilla. Los tramos de la barandilla (modulados a 2,31 m) se traerán dependiendo del tamaño de la cuba de galvanizado y del transporte. No obstante, se solicita de nuevo un plano en cad de la empresa metálica asignada para ser aprobado por la DF antes de su fabricación.Se nos indica que esta semana se </w:t>
-      </w:r>
-      <w:r>
-        <w:rPr>
-          <w:sz w:val="17"/>
-        </w:rPr>
-        <w:lastRenderedPageBreak/>
-        <w:t>replantearán las vigas de cubierta, por parte de los carpinteros contratados, para empezar con su fabricación y comenzar con su colocación en octubre.La DF solicita cuanto antes la contratación de los trabajos de cantería. Igualmente, solicita de nuevo se agilicen los trabajos de subcontratación de los distintos oficios a la mayor brevedad posible.En esta reunión, estuvo presente el carpintero subcontratado para las obras, al que se le enviará el plano con los ajustes de la cubierta en obra y a él se le ha pedido las siguientes muestras de:  - Perfil de la carpintería exterior.  - Pavimento de tarima.  - Las divisiones de los aseos.</w:t>
-      </w:r>
-    </w:p>
-    <w:p>
-      <w:r>
-        <w:rPr>
-          <w:b/>
-          <w:sz w:val="18"/>
-        </w:rPr>
         <w:t>Respecto a los restos arqueológicos</w:t>
       </w:r>
     </w:p>
     <w:p>
-      <w:pPr>
-        <w:ind w:left="288"/>
-      </w:pPr>
-      <w:r>
-        <w:rPr>
-          <w:sz w:val="17"/>
-        </w:rPr>
-        <w:t>Pendiente de consulta al Servizo do Patrimonio Cultural el pavimento de la zona derecha. La DF ya tiene una solución a proponer.En el volumen derecho, donde está el muro original del castillo. Se consolidará el existente.Pendiente de consulta al Servizo do Patrimonio Cultural del pequeño acabado del suelo del pozo aparecido en las caballerizas. La DF ya tiene una solución a proponer, pendiente de enviar la fotogrametría el arqueólogo.Decisión sobre la excavación con medidas de seguridad de la fosa séptica. Consultado por el arqueólogo de la obra al Servizo do Patrimonio Cultural puede realizarse la excavación de forma no manual, dada su peligrosidad, pero deberá estar presente cuando se realice la misma.Ante los restos aparecidos la solución principal será no injerir en los mismos, no actuando sobre ellos, separándose y protegerlos según indicaciones del Servizo do Patrimonio Cultural. Indicar que, con esta solución, no se retrasan los trabajos en obra.</w:t>
+      <w:r>
+        <w:t xml:space="preserve">Pendiente de consulta al Servizo do Patrimonio Cultural el pavimento de la zona derecha. La DF ya tiene una solución a proponer.En el volumen derecho, donde está el muro original del castillo. Se consolidará el existente.Pendiente de consulta al Servizo do Patrimonio Cultural del pequeño acabado del suelo del pozo aparecido en las caballerizas. La DF ya tiene una solución a proponer, pendiente de enviar la fotogrametría el arqueólogo.Decisión sobre la excavación con medidas de seguridad de la fosa séptica. Consultado por el arqueólogo de la obra al Servizo do Patrimonio Cultural puede realizarse la excavación de forma no manual, dada su peligrosidad, pero deberá estar presente cuando se realice la misma.Ante los restos aparecidos la solución principal será no injerir en los mismos, no actuando sobre ellos, separándose y protegerlos según indicaciones del Servizo do Patrimonio Cultural. </w:t>
+      </w:r>
+      <w:proofErr w:type="gramStart"/>
+      <w:r>
+        <w:t>Indicar</w:t>
+      </w:r>
+      <w:proofErr w:type="gramEnd"/>
+      <w:r>
+        <w:t xml:space="preserve"> que, con esta solución, no se retrasan los trabajos en obra.</w:t>
       </w:r>
     </w:p>
     <w:p>
@@ -927,23 +973,24 @@
       </w:r>
     </w:p>
     <w:p>
-      <w:r>
-        <w:rPr>
-          <w:b/>
-          <w:sz w:val="18"/>
-        </w:rPr>
+      <w:pPr>
+        <w:pStyle w:val="Ttulo3"/>
+      </w:pPr>
+      <w:r>
         <w:t>Medidas Preventivas e EPIS</w:t>
       </w:r>
     </w:p>
     <w:p>
-      <w:pPr>
-        <w:ind w:left="288"/>
-      </w:pPr>
-      <w:r>
-        <w:rPr>
-          <w:sz w:val="17"/>
-        </w:rPr>
-        <w:t>Se recuerda por parte del Coordinador de Seguridad y salud, a los trabajadores que deben de utilizar los EPIS establecidos durante los trabajos que se está llevando a cabo (gafas, guantes, mascarillas, …).Se recuerda que todos los agentes que intervienen en la obra deben de evitar circular pegados a los muros de carga, por precaución ante cualquier desprendimiento de estos, mientras no estén consolidados. En el caso de tener que trabajar al pié de uno de estos muros no consolidado, se montará una marquesina para proteger al/a los trabajador/es.Se ordena que los trabajadores que están trabajando en la coronación de los muros, lleven arnés y estén sujetos a una línea de vida.Se recuerda que deben de ser revisados antes de iniciar los trabajos diariamente, el estado de los andamios y de las líneas de vida.Se recuerda que no se puede trabajar debajo de la chimenea de fibrocemento y la fábrica de ladrillo que la recubre, hasta que se retire la chimenea.</w:t>
+      <w:r>
+        <w:t>Se recuerda por parte del Coordinador de Seguridad y salud, a los trabajadores que deben de utilizar los EPIS establecidos durante los trabajos que se está llevando a cabo (gafas, guantes, mascarillas, …</w:t>
+      </w:r>
+      <w:proofErr w:type="gramStart"/>
+      <w:r>
+        <w:t>).Se</w:t>
+      </w:r>
+      <w:proofErr w:type="gramEnd"/>
+      <w:r>
+        <w:t xml:space="preserve"> recuerda que todos los agentes que intervienen en la obra deben de evitar circular pegados a los muros de carga, por precaución ante cualquier desprendimiento de estos, mientras no estén consolidados. En el caso de tener que trabajar al pié de uno de estos muros no consolidado, se montará una marquesina para proteger al/a los trabajador/es.Se ordena que los trabajadores que están trabajando en la coronación de los muros, lleven arnés y estén sujetos a una línea de vida.Se recuerda que deben de ser revisados antes de iniciar los trabajos diariamente, el estado de los andamios y de las líneas de vida.Se recuerda que no se puede trabajar debajo de la chimenea de fibrocemento y la fábrica de ladrillo que la recubre, hasta que se retire la chimenea.</w:t>
       </w:r>
     </w:p>
     <w:p>
@@ -955,23 +1002,20 @@
       </w:r>
     </w:p>
     <w:p>
-      <w:r>
-        <w:rPr>
-          <w:b/>
-          <w:sz w:val="18"/>
-        </w:rPr>
+      <w:pPr>
+        <w:pStyle w:val="Ttulo3"/>
+      </w:pPr>
+      <w:r>
         <w:t>Próximas Actuaciones</w:t>
       </w:r>
     </w:p>
     <w:p>
-      <w:pPr>
-        <w:ind w:left="288"/>
-      </w:pPr>
-      <w:r>
-        <w:rPr>
-          <w:sz w:val="17"/>
-        </w:rPr>
-        <w:t>En cuanto a los trabajos de cantería y nuevas piezas, se indica al jefe de obra la urgencia de comenzar estos trabajos para poder continuar con la cubierta.Se solicita agilizar los trabajos y contratación del pavimento interior de cafetería, debido a la carencia de personal y subcontratas especializadas en este tipo de pavimentos.Se continúa con limpieza, demoliciones y encintados en muros de cantería.Se comienza la preparación de coronación de muro de cafetería para recibir el apoyo de la estructura.Se continúa con el retacado de muros de cachotería por la cara interior.</w:t>
+      <w:r>
+        <w:t xml:space="preserve">En cuanto a los trabajos de cantería y nuevas piezas, se indica al jefe de obra la urgencia de comenzar estos trabajos para poder continuar con la cubierta.Se solicita agilizar los trabajos y contratación del pavimento interior de cafetería, debido a la carencia de personal y subcontratas especializadas en este tipo de pavimentos.Se continúa con limpieza, demoliciones y encintados en muros de cantería.Se </w:t>
+      </w:r>
+      <w:r>
+        <w:lastRenderedPageBreak/>
+        <w:t>comienza la preparación de coronación de muro de cafetería para recibir el apoyo de la estructura.Se continúa con el retacado de muros de cachotería por la cara interior.</w:t>
       </w:r>
     </w:p>
     <w:p>
@@ -983,98 +1027,44 @@
       </w:r>
     </w:p>
     <w:p>
-      <w:pPr>
-        <w:spacing w:before="40" w:after="60"/>
-        <w:ind w:left="288"/>
-      </w:pPr>
-      <w:r>
-        <w:rPr>
-          <w:b/>
-        </w:rPr>
-        <w:t xml:space="preserve">• </w:t>
-      </w:r>
-      <w:r>
-        <w:rPr>
-          <w:color w:val="1E293B"/>
-          <w:sz w:val="17"/>
-        </w:rPr>
-        <w:t>Se recuerda por parte del Coordinador de Seguridad y salud, a los trabajadores que deben de utilizar los EPIS establecidos durante los trabajos que se está llevando a cabo (gafas, guantes, mascarillas, …).</w:t>
-      </w:r>
-    </w:p>
-    <w:p>
-      <w:pPr>
-        <w:spacing w:before="40" w:after="60"/>
-        <w:ind w:left="288"/>
-      </w:pPr>
-      <w:r>
-        <w:rPr>
-          <w:b/>
-        </w:rPr>
-        <w:t xml:space="preserve">• </w:t>
-      </w:r>
-      <w:r>
-        <w:rPr>
-          <w:color w:val="1E293B"/>
-          <w:sz w:val="17"/>
-        </w:rPr>
-        <w:t>Se recuerda que todos los agentes que intervienen en la obra deben de evitar circular pegados a los muros de carga, por precaución ante cualquier desprendimiento de estos, mientras no estén consolidados. En el caso de tener que trabajar al pié de uno de estos muros no consolidado, se montará una marquesina para proteger al/a los trabajador/es.</w:t>
-      </w:r>
-    </w:p>
-    <w:p>
-      <w:pPr>
-        <w:spacing w:before="40" w:after="60"/>
-        <w:ind w:left="288"/>
-      </w:pPr>
-      <w:r>
-        <w:rPr>
-          <w:b/>
-        </w:rPr>
-        <w:t xml:space="preserve">• </w:t>
-      </w:r>
-      <w:r>
-        <w:rPr>
-          <w:color w:val="1E293B"/>
-          <w:sz w:val="17"/>
-        </w:rPr>
-        <w:t>Se ordena que los trabajadores que están trabajando en la coronación de los muros, lleven arnés y estén sujetos a una línea de vida.</w:t>
-      </w:r>
-    </w:p>
-    <w:p>
-      <w:pPr>
-        <w:spacing w:before="40" w:after="60"/>
-        <w:ind w:left="288"/>
-      </w:pPr>
-      <w:r>
-        <w:rPr>
-          <w:b/>
-        </w:rPr>
-        <w:t xml:space="preserve">• </w:t>
-      </w:r>
-      <w:r>
-        <w:rPr>
-          <w:color w:val="1E293B"/>
-          <w:sz w:val="17"/>
-        </w:rPr>
-        <w:t>Se recuerda que deben de ser revisados antes de iniciar los trabajos diariamente, el estado de los andamios y de las líneas de vida.</w:t>
-      </w:r>
-    </w:p>
-    <w:p>
-      <w:pPr>
-        <w:spacing w:before="40" w:after="60"/>
-        <w:ind w:left="288"/>
-      </w:pPr>
-      <w:r>
-        <w:rPr>
-          <w:b/>
-        </w:rPr>
-        <w:t xml:space="preserve">• </w:t>
-      </w:r>
-      <w:r>
-        <w:rPr>
-          <w:color w:val="1E293B"/>
-          <w:sz w:val="17"/>
-        </w:rPr>
-        <w:t>Se recuerda que no se puede trabajar debajo de la chimenea de fibrocemento y la fábrica de ladrillo que la recubre, hasta que se retire la chimenea.</w:t>
+      <w:r>
+        <w:t>• Se recuerda por parte del Coordinador de Seguridad y salud, a los trabajadores que deben de utilizar los EPIS establecidos durante los trabajos que se está llevando a cabo (gafas, guantes, mascarillas, …).</w:t>
+      </w:r>
+    </w:p>
+    <w:p>
+      <w:r>
+        <w:t xml:space="preserve">• Se recuerda que todos los agentes que intervienen en la obra deben de evitar circular pegados a los muros de carga, por precaución ante cualquier desprendimiento de estos, mientras no estén consolidados. En el caso de tener que trabajar al </w:t>
+      </w:r>
+      <w:proofErr w:type="spellStart"/>
+      <w:r>
+        <w:t>pié</w:t>
+      </w:r>
+      <w:proofErr w:type="spellEnd"/>
+      <w:r>
+        <w:t xml:space="preserve"> de uno de estos muros no consolidado, se montará una marquesina para proteger al/</w:t>
+      </w:r>
+      <w:proofErr w:type="gramStart"/>
+      <w:r>
+        <w:t>a los trabajador</w:t>
+      </w:r>
+      <w:proofErr w:type="gramEnd"/>
+      <w:r>
+        <w:t>/es.</w:t>
+      </w:r>
+    </w:p>
+    <w:p>
+      <w:r>
+        <w:t>• Se ordena que los trabajadores que están trabajando en la coronación de los muros, lleven arnés y estén sujetos a una línea de vida.</w:t>
+      </w:r>
+    </w:p>
+    <w:p>
+      <w:r>
+        <w:t>• Se recuerda que deben de ser revisados antes de iniciar los trabajos diariamente, el estado de los andamios y de las líneas de vida.</w:t>
+      </w:r>
+    </w:p>
+    <w:p>
+      <w:r>
+        <w:t>• Se recuerda que no se puede trabajar debajo de la chimenea de fibrocemento y la fábrica de ladrillo que la recubre, hasta que se retire la chimenea.</w:t>
       </w:r>
     </w:p>
     <w:p>
@@ -1082,103 +1072,40 @@
         <w:pStyle w:val="Ttulo1"/>
       </w:pPr>
       <w:r>
-        <w:lastRenderedPageBreak/>
         <w:t>PRÓXIMAS ACTUACIÓNS PREVISTAS</w:t>
       </w:r>
     </w:p>
     <w:p>
-      <w:pPr>
-        <w:spacing w:before="40" w:after="60"/>
-        <w:ind w:left="288"/>
-      </w:pPr>
-      <w:r>
-        <w:rPr>
-          <w:b/>
-        </w:rPr>
-        <w:t xml:space="preserve">• </w:t>
-      </w:r>
-      <w:r>
-        <w:rPr>
-          <w:color w:val="1E293B"/>
-          <w:sz w:val="17"/>
-        </w:rPr>
-        <w:t>En cuanto a los trabajos de cantería y nuevas piezas, se indica al jefe de obra la urgencia de comenzar estos trabajos para poder continuar con la cubierta.</w:t>
-      </w:r>
-    </w:p>
-    <w:p>
-      <w:pPr>
-        <w:spacing w:before="40" w:after="60"/>
-        <w:ind w:left="288"/>
-      </w:pPr>
-      <w:r>
-        <w:rPr>
-          <w:b/>
-        </w:rPr>
-        <w:t xml:space="preserve">• </w:t>
-      </w:r>
-      <w:r>
-        <w:rPr>
-          <w:color w:val="1E293B"/>
-          <w:sz w:val="17"/>
-        </w:rPr>
-        <w:t>Se solicita agilizar los trabajos y contratación del pavimento interior de cafetería, debido a la carencia de personal y subcontratas especializadas en este tipo de pavimentos.</w:t>
-      </w:r>
-    </w:p>
-    <w:p>
-      <w:pPr>
-        <w:spacing w:before="40" w:after="60"/>
-        <w:ind w:left="288"/>
-      </w:pPr>
-      <w:r>
-        <w:rPr>
-          <w:b/>
-        </w:rPr>
-        <w:t xml:space="preserve">• </w:t>
-      </w:r>
-      <w:r>
-        <w:rPr>
-          <w:color w:val="1E293B"/>
-          <w:sz w:val="17"/>
-        </w:rPr>
-        <w:t>Se continúa con limpieza, demoliciones y encintados en muros de cantería.</w:t>
-      </w:r>
-    </w:p>
-    <w:p>
-      <w:pPr>
-        <w:spacing w:before="40" w:after="60"/>
-        <w:ind w:left="288"/>
-      </w:pPr>
-      <w:r>
-        <w:rPr>
-          <w:b/>
-        </w:rPr>
-        <w:t xml:space="preserve">• </w:t>
-      </w:r>
-      <w:r>
-        <w:rPr>
-          <w:color w:val="1E293B"/>
-          <w:sz w:val="17"/>
-        </w:rPr>
-        <w:t>Se comienza la preparación de coronación de muro de cafetería para recibir el apoyo de la estructura.</w:t>
-      </w:r>
-    </w:p>
-    <w:p>
-      <w:pPr>
-        <w:spacing w:before="40" w:after="60"/>
-        <w:ind w:left="288"/>
-      </w:pPr>
-      <w:r>
-        <w:rPr>
-          <w:b/>
-        </w:rPr>
-        <w:t xml:space="preserve">• </w:t>
-      </w:r>
-      <w:r>
-        <w:rPr>
-          <w:color w:val="1E293B"/>
-          <w:sz w:val="17"/>
-        </w:rPr>
-        <w:t>Se continúa con el retacado de muros de cachotería por la cara interior.</w:t>
+      <w:r>
+        <w:t>• En cuanto a los trabajos de cantería y nuevas piezas, se indica al jefe de obra la urgencia de comenzar estos trabajos para poder continuar con la cubierta.</w:t>
+      </w:r>
+    </w:p>
+    <w:p>
+      <w:r>
+        <w:t>• Se solicita agilizar los trabajos y contratación del pavimento interior de cafetería, debido a la carencia de personal y subcontratas especializadas en este tipo de pavimentos.</w:t>
+      </w:r>
+    </w:p>
+    <w:p>
+      <w:r>
+        <w:t>• Se continúa con limpieza, demoliciones y encintados en muros de cantería.</w:t>
+      </w:r>
+    </w:p>
+    <w:p>
+      <w:r>
+        <w:t>• Se comienza la preparación de coronación de muro de cafetería para recibir el apoyo de la estructura.</w:t>
+      </w:r>
+    </w:p>
+    <w:p>
+      <w:r>
+        <w:t xml:space="preserve">• Se continúa con el retacado de muros de </w:t>
+      </w:r>
+      <w:proofErr w:type="spellStart"/>
+      <w:r>
+        <w:t>cachotería</w:t>
+      </w:r>
+      <w:proofErr w:type="spellEnd"/>
+      <w:r>
+        <w:t xml:space="preserve"> por la cara interior.</w:t>
       </w:r>
     </w:p>
     <w:p>
@@ -1190,11 +1117,16 @@
       </w:r>
     </w:p>
     <w:p>
+      <w:pPr>
+        <w:rPr>
+          <w:szCs w:val="20"/>
+        </w:rPr>
+      </w:pPr>
       <w:r>
         <w:rPr>
           <w:i/>
           <w:color w:val="475569"/>
-          <w:sz w:val="17"/>
+          <w:szCs w:val="20"/>
         </w:rPr>
         <w:t>En Ferrol a 9 de setembro de 2025. Para que así conste e aos efectos oportunos, asinan a presente acta:</w:t>
       </w:r>
@@ -1226,6 +1158,12 @@
             </w:tcMar>
           </w:tcPr>
           <w:p>
+            <w:pPr>
+              <w:rPr>
+                <w:b/>
+                <w:sz w:val="17"/>
+              </w:rPr>
+            </w:pPr>
             <w:r>
               <w:rPr>
                 <w:b/>
@@ -1256,6 +1194,16 @@
               </w:rPr>
               <w:br/>
             </w:r>
+          </w:p>
+          <w:p>
+            <w:pPr>
+              <w:rPr>
+                <w:b/>
+                <w:sz w:val="17"/>
+              </w:rPr>
+            </w:pPr>
+          </w:p>
+          <w:p>
             <w:r>
               <w:rPr>
                 <w:b/>
@@ -1291,6 +1239,12 @@
             </w:tcMar>
           </w:tcPr>
           <w:p>
+            <w:pPr>
+              <w:rPr>
+                <w:b/>
+                <w:sz w:val="17"/>
+              </w:rPr>
+            </w:pPr>
             <w:r>
               <w:rPr>
                 <w:b/>
@@ -1321,6 +1275,16 @@
               </w:rPr>
               <w:br/>
             </w:r>
+          </w:p>
+          <w:p>
+            <w:pPr>
+              <w:rPr>
+                <w:b/>
+                <w:sz w:val="17"/>
+              </w:rPr>
+            </w:pPr>
+          </w:p>
+          <w:p>
             <w:r>
               <w:rPr>
                 <w:b/>
@@ -1351,6 +1315,7 @@
         <w:pStyle w:val="Ttulo1"/>
       </w:pPr>
       <w:r>
+        <w:lastRenderedPageBreak/>
         <w:t>ANEXO REPORTAXE FOTOGRÁFICO</w:t>
       </w:r>
     </w:p>
@@ -1829,7 +1794,6 @@
     <w:lvl w:ilvl="0">
       <w:start w:val="1"/>
       <w:numFmt w:val="decimal"/>
-      <w:pStyle w:val="Ttulo1"/>
       <w:suff w:val="space"/>
       <w:lvlText w:val="%1."/>
       <w:lvlJc w:val="left"/>
@@ -1843,7 +1807,6 @@
     <w:lvl w:ilvl="1">
       <w:start w:val="1"/>
       <w:numFmt w:val="decimal"/>
-      <w:pStyle w:val="Ttulo2"/>
       <w:suff w:val="space"/>
       <w:lvlText w:val="%1.%2."/>
       <w:lvlJc w:val="left"/>
@@ -2362,17 +2325,15 @@
     <w:link w:val="Ttulo1Car"/>
     <w:uiPriority w:val="9"/>
     <w:qFormat/>
-    <w:rsid w:val="00276DAD"/>
+    <w:rsid w:val="00C23674"/>
     <w:pPr>
       <w:keepNext/>
       <w:keepLines/>
-      <w:numPr>
-        <w:numId w:val="1"/>
-      </w:numPr>
       <w:pBdr>
         <w:bottom w:val="single" w:sz="8" w:space="1" w:color="4C94D8" w:themeColor="text2" w:themeTint="80"/>
       </w:pBdr>
       <w:spacing w:before="360" w:after="80"/>
+      <w:ind w:left="0"/>
       <w:outlineLvl w:val="0"/>
     </w:pPr>
     <w:rPr>
@@ -2391,18 +2352,15 @@
     <w:uiPriority w:val="9"/>
     <w:unhideWhenUsed/>
     <w:qFormat/>
-    <w:rsid w:val="00276DAD"/>
+    <w:rsid w:val="00C23674"/>
     <w:pPr>
       <w:keepNext/>
       <w:keepLines/>
-      <w:numPr>
-        <w:ilvl w:val="1"/>
-        <w:numId w:val="1"/>
-      </w:numPr>
       <w:pBdr>
         <w:bottom w:val="single" w:sz="4" w:space="1" w:color="4C94D8" w:themeColor="text2" w:themeTint="80"/>
       </w:pBdr>
       <w:spacing w:after="80"/>
+      <w:ind w:left="0"/>
       <w:outlineLvl w:val="1"/>
     </w:pPr>
     <w:rPr>
@@ -2419,10 +2377,9 @@
     <w:next w:val="Normal"/>
     <w:link w:val="Ttulo3Car"/>
     <w:uiPriority w:val="9"/>
-    <w:semiHidden/>
     <w:unhideWhenUsed/>
     <w:qFormat/>
-    <w:rsid w:val="000200DB"/>
+    <w:rsid w:val="00C23674"/>
     <w:pPr>
       <w:keepNext/>
       <w:keepLines/>
@@ -2431,8 +2388,7 @@
     </w:pPr>
     <w:rPr>
       <w:rFonts w:eastAsiaTheme="majorEastAsia" w:cstheme="majorBidi"/>
-      <w:color w:val="0F4761" w:themeColor="accent1" w:themeShade="BF"/>
-      <w:sz w:val="28"/>
+      <w:b/>
       <w:szCs w:val="28"/>
     </w:rPr>
   </w:style>
@@ -2627,12 +2583,11 @@
     <w:basedOn w:val="Fuentedeprrafopredeter"/>
     <w:link w:val="Ttulo3"/>
     <w:uiPriority w:val="9"/>
-    <w:semiHidden/>
-    <w:rsid w:val="000200DB"/>
+    <w:rsid w:val="00C23674"/>
     <w:rPr>
-      <w:rFonts w:eastAsiaTheme="majorEastAsia" w:cstheme="majorBidi"/>
-      <w:color w:val="0F4761" w:themeColor="accent1" w:themeShade="BF"/>
-      <w:sz w:val="28"/>
+      <w:rFonts w:ascii="Arial" w:eastAsiaTheme="majorEastAsia" w:hAnsi="Arial" w:cstheme="majorBidi"/>
+      <w:b/>
+      <w:sz w:val="20"/>
       <w:szCs w:val="28"/>
     </w:rPr>
   </w:style>

</xml_diff>

<commit_message>
feat: integracion completa e paridade 1:1:1 coas novas plantillas oficiais (reunion, semanal, mensual)
</commit_message>
<xml_diff>
--- a/ejemplo_modificado_acta_semanal.docx
+++ b/ejemplo_modificado_acta_semanal.docx
@@ -12,438 +12,666 @@
     </w:p>
     <w:tbl>
       <w:tblPr>
-        <w:tblW w:w="9842" w:type="dxa"/>
-        <w:tblLayout w:type="fixed"/>
+        <w:tblStyle w:val="Tablaconcuadrcula1clara-nfasis1"/>
+        <w:tblW w:w="9874" w:type="dxa"/>
         <w:tblLook w:val="04A0" w:firstRow="1" w:lastRow="0" w:firstColumn="1" w:lastColumn="0" w:noHBand="0" w:noVBand="1"/>
       </w:tblPr>
       <w:tblGrid>
-        <w:gridCol w:w="5245"/>
-        <w:gridCol w:w="4597"/>
+        <w:gridCol w:w="2293"/>
+        <w:gridCol w:w="2527"/>
+        <w:gridCol w:w="2688"/>
+        <w:gridCol w:w="2366"/>
       </w:tblGrid>
       <w:tr>
         <w:trPr>
-          <w:trHeight w:val="397"/>
+          <w:cnfStyle w:val="100000000000" w:firstRow="1" w:lastRow="0" w:firstColumn="0" w:lastColumn="0" w:oddVBand="0" w:evenVBand="0" w:oddHBand="0" w:evenHBand="0" w:firstRowFirstColumn="0" w:firstRowLastColumn="0" w:lastRowFirstColumn="0" w:lastRowLastColumn="0"/>
+          <w:trHeight w:val="895"/>
         </w:trPr>
         <w:tc>
           <w:tcPr>
-            <w:tcW w:w="5245" w:type="dxa"/>
+            <w:cnfStyle w:val="001000000000" w:firstRow="0" w:lastRow="0" w:firstColumn="1" w:lastColumn="0" w:oddVBand="0" w:evenVBand="0" w:oddHBand="0" w:evenHBand="0" w:firstRowFirstColumn="0" w:firstRowLastColumn="0" w:lastRowFirstColumn="0" w:lastRowLastColumn="0"/>
+            <w:tcW w:w="2293" w:type="dxa"/>
             <w:tcBorders>
-              <w:bottom w:val="single" w:sz="2" w:space="0" w:color="E2E8F0"/>
+              <w:top w:val="nil"/>
+              <w:left w:val="nil"/>
+              <w:right w:val="nil"/>
             </w:tcBorders>
-            <w:tcMar>
-              <w:top w:w="35" w:type="dxa"/>
-              <w:left w:w="40" w:type="dxa"/>
-              <w:bottom w:w="35" w:type="dxa"/>
-              <w:right w:w="40" w:type="dxa"/>
-            </w:tcMar>
             <w:vAlign w:val="center"/>
           </w:tcPr>
           <w:p>
             <w:pPr>
-              <w:spacing w:before="0" w:after="0"/>
-              <w:ind w:left="107"/>
-              <w:rPr>
-                <w:szCs w:val="20"/>
-              </w:rPr>
-            </w:pPr>
-            <w:proofErr w:type="spellStart"/>
-            <w:r>
-              <w:rPr>
-                <w:color w:val="64748B"/>
-                <w:szCs w:val="20"/>
-              </w:rPr>
-              <w:t>Proxecto</w:t>
-            </w:r>
-            <w:proofErr w:type="spellEnd"/>
-            <w:r>
-              <w:rPr>
-                <w:color w:val="64748B"/>
-                <w:szCs w:val="20"/>
-              </w:rPr>
-              <w:t xml:space="preserve">: </w:t>
-            </w:r>
-            <w:r>
-              <w:rPr>
-                <w:b/>
-                <w:szCs w:val="20"/>
-              </w:rPr>
-              <w:t xml:space="preserve">Refundido de actuaciones en el castillo de San Felipe, en el marco del plan de recuperación, transformación y resiliencia –financiado por la Unión Europea – Next </w:t>
-            </w:r>
-            <w:proofErr w:type="spellStart"/>
-            <w:r>
-              <w:rPr>
-                <w:b/>
-                <w:szCs w:val="20"/>
-              </w:rPr>
-              <w:t>Generation</w:t>
-            </w:r>
-            <w:proofErr w:type="spellEnd"/>
-            <w:r>
-              <w:rPr>
-                <w:b/>
-                <w:szCs w:val="20"/>
-              </w:rPr>
-              <w:t xml:space="preserve"> EU</w:t>
+              <w:spacing w:before="0"/>
+              <w:ind w:left="0"/>
+              <w:rPr>
+                <w:sz w:val="18"/>
+                <w:szCs w:val="18"/>
+              </w:rPr>
+            </w:pPr>
+            <w:r>
+              <w:rPr>
+                <w:sz w:val="18"/>
+                <w:szCs w:val="18"/>
+              </w:rPr>
+              <w:t>Proxecto:</w:t>
             </w:r>
           </w:p>
         </w:tc>
         <w:tc>
           <w:tcPr>
-            <w:tcW w:w="4597" w:type="dxa"/>
+            <w:tcW w:w="7581" w:type="dxa"/>
+            <w:gridSpan w:val="3"/>
             <w:tcBorders>
-              <w:bottom w:val="single" w:sz="2" w:space="0" w:color="E2E8F0"/>
+              <w:top w:val="nil"/>
+              <w:left w:val="nil"/>
+              <w:right w:val="nil"/>
             </w:tcBorders>
-            <w:tcMar>
-              <w:top w:w="35" w:type="dxa"/>
-              <w:left w:w="40" w:type="dxa"/>
-              <w:bottom w:w="35" w:type="dxa"/>
-              <w:right w:w="40" w:type="dxa"/>
-            </w:tcMar>
             <w:vAlign w:val="center"/>
           </w:tcPr>
           <w:p>
             <w:pPr>
-              <w:spacing w:before="0" w:after="0"/>
-              <w:ind w:left="107"/>
-              <w:rPr>
-                <w:szCs w:val="20"/>
-              </w:rPr>
-            </w:pPr>
-            <w:r>
-              <w:rPr>
-                <w:color w:val="64748B"/>
-                <w:szCs w:val="20"/>
-              </w:rPr>
-              <w:t xml:space="preserve">Data da visita: </w:t>
-            </w:r>
-            <w:r>
-              <w:rPr>
-                <w:b/>
-                <w:szCs w:val="20"/>
-              </w:rPr>
-              <w:t>09/09/2025</w:t>
+              <w:spacing w:before="0"/>
+              <w:ind w:left="0"/>
+              <w:cnfStyle w:val="100000000000" w:firstRow="1" w:lastRow="0" w:firstColumn="0" w:lastColumn="0" w:oddVBand="0" w:evenVBand="0" w:oddHBand="0" w:evenHBand="0" w:firstRowFirstColumn="0" w:firstRowLastColumn="0" w:lastRowFirstColumn="0" w:lastRowLastColumn="0"/>
+              <w:rPr>
+                <w:sz w:val="18"/>
+                <w:szCs w:val="18"/>
+              </w:rPr>
+            </w:pPr>
+            <w:r>
+              <w:rPr>
+                <w:sz w:val="18"/>
+                <w:szCs w:val="18"/>
+              </w:rPr>
+              <w:t>Refundido de actuaciones en el castillo de San Felipe, en el marco del plan de recuperación, transformación y resiliencia –financiado por la Unión Europea – Next Generation EU</w:t>
             </w:r>
           </w:p>
         </w:tc>
       </w:tr>
       <w:tr>
         <w:trPr>
-          <w:trHeight w:val="397"/>
+          <w:trHeight w:val="395"/>
         </w:trPr>
         <w:tc>
           <w:tcPr>
-            <w:tcW w:w="5245" w:type="dxa"/>
+            <w:cnfStyle w:val="001000000000" w:firstRow="0" w:lastRow="0" w:firstColumn="1" w:lastColumn="0" w:oddVBand="0" w:evenVBand="0" w:oddHBand="0" w:evenHBand="0" w:firstRowFirstColumn="0" w:firstRowLastColumn="0" w:lastRowFirstColumn="0" w:lastRowLastColumn="0"/>
+            <w:tcW w:w="2293" w:type="dxa"/>
             <w:tcBorders>
-              <w:bottom w:val="single" w:sz="2" w:space="0" w:color="E2E8F0"/>
+              <w:left w:val="nil"/>
+              <w:right w:val="nil"/>
             </w:tcBorders>
-            <w:tcMar>
-              <w:top w:w="35" w:type="dxa"/>
-              <w:left w:w="40" w:type="dxa"/>
-              <w:bottom w:w="35" w:type="dxa"/>
-              <w:right w:w="40" w:type="dxa"/>
-            </w:tcMar>
             <w:vAlign w:val="center"/>
           </w:tcPr>
           <w:p>
             <w:pPr>
-              <w:spacing w:before="0" w:after="0"/>
-              <w:ind w:left="107"/>
-              <w:rPr>
-                <w:szCs w:val="20"/>
-              </w:rPr>
-            </w:pPr>
-            <w:r>
-              <w:rPr>
-                <w:color w:val="64748B"/>
-                <w:szCs w:val="20"/>
-              </w:rPr>
-              <w:t xml:space="preserve">Emprazamento: </w:t>
-            </w:r>
-            <w:r>
-              <w:rPr>
-                <w:szCs w:val="20"/>
-              </w:rPr>
-              <w:t>Castillo de San Felipe, 15591. Concello de Ferrol</w:t>
+              <w:spacing w:before="0"/>
+              <w:ind w:left="0"/>
+              <w:rPr>
+                <w:sz w:val="18"/>
+                <w:szCs w:val="18"/>
+              </w:rPr>
+            </w:pPr>
+            <w:r>
+              <w:rPr>
+                <w:sz w:val="18"/>
+                <w:szCs w:val="18"/>
+              </w:rPr>
+              <w:t>Emprazamento</w:t>
             </w:r>
           </w:p>
         </w:tc>
         <w:tc>
           <w:tcPr>
-            <w:tcW w:w="4597" w:type="dxa"/>
+            <w:tcW w:w="7581" w:type="dxa"/>
+            <w:gridSpan w:val="3"/>
             <w:tcBorders>
-              <w:bottom w:val="single" w:sz="2" w:space="0" w:color="E2E8F0"/>
+              <w:left w:val="nil"/>
+              <w:right w:val="nil"/>
             </w:tcBorders>
-            <w:tcMar>
-              <w:top w:w="35" w:type="dxa"/>
-              <w:left w:w="40" w:type="dxa"/>
-              <w:bottom w:w="35" w:type="dxa"/>
-              <w:right w:w="40" w:type="dxa"/>
-            </w:tcMar>
             <w:vAlign w:val="center"/>
           </w:tcPr>
           <w:p>
             <w:pPr>
-              <w:spacing w:before="0" w:after="0"/>
-              <w:ind w:left="107"/>
-              <w:rPr>
-                <w:szCs w:val="20"/>
-              </w:rPr>
-            </w:pPr>
-            <w:r>
-              <w:rPr>
-                <w:color w:val="64748B"/>
-                <w:szCs w:val="20"/>
-              </w:rPr>
-              <w:t xml:space="preserve">Expediente nº: </w:t>
-            </w:r>
-            <w:r>
-              <w:rPr>
-                <w:b/>
-                <w:szCs w:val="20"/>
-              </w:rPr>
-              <w:t>AVS 03007 25/05</w:t>
+              <w:spacing w:before="0"/>
+              <w:ind w:left="0"/>
+              <w:cnfStyle w:val="000000000000" w:firstRow="0" w:lastRow="0" w:firstColumn="0" w:lastColumn="0" w:oddVBand="0" w:evenVBand="0" w:oddHBand="0" w:evenHBand="0" w:firstRowFirstColumn="0" w:firstRowLastColumn="0" w:lastRowFirstColumn="0" w:lastRowLastColumn="0"/>
+              <w:rPr>
+                <w:sz w:val="18"/>
+                <w:szCs w:val="18"/>
+              </w:rPr>
+            </w:pPr>
+            <w:r>
+              <w:rPr>
+                <w:sz w:val="18"/>
+                <w:szCs w:val="18"/>
+              </w:rPr>
+              <w:t>Castillo de San Felipe, 15591.</w:t>
             </w:r>
           </w:p>
         </w:tc>
       </w:tr>
       <w:tr>
         <w:trPr>
-          <w:trHeight w:val="397"/>
+          <w:trHeight w:val="420"/>
         </w:trPr>
         <w:tc>
           <w:tcPr>
-            <w:tcW w:w="5245" w:type="dxa"/>
+            <w:cnfStyle w:val="001000000000" w:firstRow="0" w:lastRow="0" w:firstColumn="1" w:lastColumn="0" w:oddVBand="0" w:evenVBand="0" w:oddHBand="0" w:evenHBand="0" w:firstRowFirstColumn="0" w:firstRowLastColumn="0" w:lastRowFirstColumn="0" w:lastRowLastColumn="0"/>
+            <w:tcW w:w="2293" w:type="dxa"/>
             <w:tcBorders>
-              <w:bottom w:val="single" w:sz="2" w:space="0" w:color="E2E8F0"/>
+              <w:left w:val="nil"/>
+              <w:right w:val="nil"/>
             </w:tcBorders>
-            <w:tcMar>
-              <w:top w:w="35" w:type="dxa"/>
-              <w:left w:w="40" w:type="dxa"/>
-              <w:bottom w:w="35" w:type="dxa"/>
-              <w:right w:w="40" w:type="dxa"/>
-            </w:tcMar>
             <w:vAlign w:val="center"/>
           </w:tcPr>
           <w:p>
             <w:pPr>
-              <w:spacing w:before="0" w:after="0"/>
-              <w:ind w:left="107"/>
-              <w:rPr>
-                <w:szCs w:val="20"/>
-              </w:rPr>
-            </w:pPr>
-            <w:r>
-              <w:rPr>
-                <w:color w:val="64748B"/>
-                <w:szCs w:val="20"/>
-              </w:rPr>
-              <w:t xml:space="preserve">Contratista: </w:t>
-            </w:r>
-            <w:r>
-              <w:rPr>
-                <w:b/>
-                <w:szCs w:val="20"/>
-              </w:rPr>
-              <w:t>—</w:t>
+              <w:spacing w:before="0"/>
+              <w:ind w:left="0"/>
+              <w:rPr>
+                <w:sz w:val="18"/>
+                <w:szCs w:val="18"/>
+              </w:rPr>
+            </w:pPr>
+            <w:r>
+              <w:rPr>
+                <w:sz w:val="18"/>
+                <w:szCs w:val="18"/>
+              </w:rPr>
+              <w:t>Expediente:</w:t>
             </w:r>
           </w:p>
         </w:tc>
         <w:tc>
           <w:tcPr>
-            <w:tcW w:w="4597" w:type="dxa"/>
+            <w:tcW w:w="2527" w:type="dxa"/>
             <w:tcBorders>
-              <w:bottom w:val="single" w:sz="2" w:space="0" w:color="E2E8F0"/>
+              <w:left w:val="nil"/>
+              <w:right w:val="nil"/>
             </w:tcBorders>
-            <w:tcMar>
-              <w:top w:w="35" w:type="dxa"/>
-              <w:left w:w="40" w:type="dxa"/>
-              <w:bottom w:w="35" w:type="dxa"/>
-              <w:right w:w="40" w:type="dxa"/>
-            </w:tcMar>
             <w:vAlign w:val="center"/>
           </w:tcPr>
           <w:p>
             <w:pPr>
-              <w:spacing w:before="0" w:after="0"/>
-              <w:ind w:left="107"/>
-              <w:rPr>
+              <w:spacing w:before="0"/>
+              <w:ind w:left="0"/>
+              <w:cnfStyle w:val="000000000000" w:firstRow="0" w:lastRow="0" w:firstColumn="0" w:lastColumn="0" w:oddVBand="0" w:evenVBand="0" w:oddHBand="0" w:evenHBand="0" w:firstRowFirstColumn="0" w:firstRowLastColumn="0" w:lastRowFirstColumn="0" w:lastRowLastColumn="0"/>
+              <w:rPr>
+                <w:sz w:val="18"/>
+                <w:szCs w:val="18"/>
+              </w:rPr>
+            </w:pPr>
+            <w:r>
+              <w:rPr>
+                <w:sz w:val="18"/>
+                <w:szCs w:val="18"/>
+              </w:rPr>
+              <w:t>V</w:t>
+            </w:r>
+            <w:r>
+              <w:rPr>
+                <w:sz w:val="18"/>
+                <w:szCs w:val="18"/>
+              </w:rPr>
+              <w:t>P057/T2</w:t>
+            </w:r>
+          </w:p>
+        </w:tc>
+        <w:tc>
+          <w:tcPr>
+            <w:tcW w:w="2688" w:type="dxa"/>
+            <w:tcBorders>
+              <w:left w:val="nil"/>
+              <w:right w:val="nil"/>
+            </w:tcBorders>
+            <w:vAlign w:val="center"/>
+          </w:tcPr>
+          <w:p>
+            <w:pPr>
+              <w:spacing w:before="0"/>
+              <w:ind w:left="0"/>
+              <w:cnfStyle w:val="000000000000" w:firstRow="0" w:lastRow="0" w:firstColumn="0" w:lastColumn="0" w:oddVBand="0" w:evenVBand="0" w:oddHBand="0" w:evenHBand="0" w:firstRowFirstColumn="0" w:firstRowLastColumn="0" w:lastRowFirstColumn="0" w:lastRowLastColumn="0"/>
+              <w:rPr>
+                <w:sz w:val="18"/>
+                <w:szCs w:val="18"/>
+              </w:rPr>
+            </w:pPr>
+            <w:r>
+              <w:rPr>
+                <w:sz w:val="18"/>
+                <w:szCs w:val="18"/>
+              </w:rPr>
+              <w:t>Data da acta:</w:t>
+            </w:r>
+          </w:p>
+        </w:tc>
+        <w:tc>
+          <w:tcPr>
+            <w:tcW w:w="2366" w:type="dxa"/>
+            <w:tcBorders>
+              <w:left w:val="nil"/>
+              <w:right w:val="nil"/>
+            </w:tcBorders>
+            <w:vAlign w:val="center"/>
+          </w:tcPr>
+          <w:p>
+            <w:pPr>
+              <w:spacing w:before="0"/>
+              <w:ind w:left="0"/>
+              <w:cnfStyle w:val="000000000000" w:firstRow="0" w:lastRow="0" w:firstColumn="0" w:lastColumn="0" w:oddVBand="0" w:evenVBand="0" w:oddHBand="0" w:evenHBand="0" w:firstRowFirstColumn="0" w:firstRowLastColumn="0" w:lastRowFirstColumn="0" w:lastRowLastColumn="0"/>
+              <w:rPr>
+                <w:sz w:val="18"/>
+                <w:szCs w:val="18"/>
+              </w:rPr>
+            </w:pPr>
+            <w:r>
+              <w:rPr>
+                <w:b/>
                 <w:szCs w:val="20"/>
               </w:rPr>
-            </w:pPr>
-            <w:r>
-              <w:rPr>
-                <w:color w:val="64748B"/>
+              <w:t>09/09/202</w:t>
+            </w:r>
+            <w:r>
+              <w:rPr>
+                <w:b/>
                 <w:szCs w:val="20"/>
               </w:rPr>
-              <w:t xml:space="preserve">Estado da acta: </w:t>
-            </w:r>
-            <w:r>
-              <w:rPr>
-                <w:szCs w:val="20"/>
-              </w:rPr>
-              <w:t>○ Borrador</w:t>
+              <w:t>5</w:t>
             </w:r>
           </w:p>
         </w:tc>
       </w:tr>
       <w:tr>
         <w:trPr>
-          <w:trHeight w:val="397"/>
+          <w:trHeight w:val="510"/>
         </w:trPr>
         <w:tc>
           <w:tcPr>
-            <w:tcW w:w="5245" w:type="dxa"/>
+            <w:cnfStyle w:val="001000000000" w:firstRow="0" w:lastRow="0" w:firstColumn="1" w:lastColumn="0" w:oddVBand="0" w:evenVBand="0" w:oddHBand="0" w:evenHBand="0" w:firstRowFirstColumn="0" w:firstRowLastColumn="0" w:lastRowFirstColumn="0" w:lastRowLastColumn="0"/>
+            <w:tcW w:w="2293" w:type="dxa"/>
             <w:tcBorders>
-              <w:bottom w:val="single" w:sz="2" w:space="0" w:color="E2E8F0"/>
+              <w:left w:val="nil"/>
+              <w:right w:val="nil"/>
             </w:tcBorders>
-            <w:tcMar>
-              <w:top w:w="35" w:type="dxa"/>
-              <w:left w:w="40" w:type="dxa"/>
-              <w:bottom w:w="35" w:type="dxa"/>
-              <w:right w:w="40" w:type="dxa"/>
-            </w:tcMar>
             <w:vAlign w:val="center"/>
           </w:tcPr>
           <w:p>
             <w:pPr>
-              <w:spacing w:before="0" w:after="0"/>
-              <w:ind w:left="107"/>
-              <w:rPr>
-                <w:szCs w:val="20"/>
-              </w:rPr>
-            </w:pPr>
-            <w:r>
-              <w:rPr>
-                <w:color w:val="64748B"/>
-                <w:szCs w:val="20"/>
-              </w:rPr>
-              <w:t xml:space="preserve">Dirección de obra: </w:t>
-            </w:r>
-            <w:r>
-              <w:rPr>
-                <w:b/>
-                <w:color w:val="1E3A8A"/>
-                <w:szCs w:val="20"/>
-              </w:rPr>
-              <w:t>Rosa Vilas Romalde y Sergio Beceiro Lodeiro (DO)</w:t>
+              <w:spacing w:before="0"/>
+              <w:ind w:left="0"/>
+              <w:rPr>
+                <w:sz w:val="18"/>
+                <w:szCs w:val="18"/>
+              </w:rPr>
+            </w:pPr>
+            <w:r>
+              <w:rPr>
+                <w:sz w:val="18"/>
+                <w:szCs w:val="18"/>
+              </w:rPr>
+              <w:t>Dirección de obra (DO):</w:t>
             </w:r>
           </w:p>
         </w:tc>
         <w:tc>
           <w:tcPr>
-            <w:tcW w:w="4597" w:type="dxa"/>
+            <w:tcW w:w="2527" w:type="dxa"/>
             <w:tcBorders>
-              <w:bottom w:val="single" w:sz="2" w:space="0" w:color="E2E8F0"/>
+              <w:left w:val="nil"/>
+              <w:right w:val="nil"/>
             </w:tcBorders>
-            <w:tcMar>
-              <w:top w:w="35" w:type="dxa"/>
-              <w:left w:w="40" w:type="dxa"/>
-              <w:bottom w:w="35" w:type="dxa"/>
-              <w:right w:w="40" w:type="dxa"/>
-            </w:tcMar>
             <w:vAlign w:val="center"/>
           </w:tcPr>
           <w:p>
             <w:pPr>
-              <w:spacing w:before="0" w:after="0"/>
-              <w:ind w:left="107"/>
-              <w:rPr>
-                <w:szCs w:val="20"/>
-              </w:rPr>
-            </w:pPr>
-            <w:r>
-              <w:rPr>
-                <w:color w:val="64748B"/>
-                <w:szCs w:val="20"/>
-              </w:rPr>
-              <w:t xml:space="preserve">Dirección de execución: </w:t>
-            </w:r>
-            <w:r>
-              <w:rPr>
-                <w:b/>
-                <w:color w:val="0284C7"/>
-                <w:szCs w:val="20"/>
-              </w:rPr>
-              <w:t>Ana Gallego Núñez (DEM)</w:t>
+              <w:spacing w:before="0"/>
+              <w:ind w:left="0"/>
+              <w:cnfStyle w:val="000000000000" w:firstRow="0" w:lastRow="0" w:firstColumn="0" w:lastColumn="0" w:oddVBand="0" w:evenVBand="0" w:oddHBand="0" w:evenHBand="0" w:firstRowFirstColumn="0" w:firstRowLastColumn="0" w:lastRowFirstColumn="0" w:lastRowLastColumn="0"/>
+              <w:rPr>
+                <w:sz w:val="18"/>
+                <w:szCs w:val="18"/>
+                <w:lang w:val="en-GB"/>
+              </w:rPr>
+            </w:pPr>
+            <w:r>
+              <w:rPr>
+                <w:sz w:val="18"/>
+                <w:szCs w:val="18"/>
+                <w:lang w:val="en-GB"/>
+              </w:rPr>
+              <w:t xml:space="preserve">Nome </w:t>
+            </w:r>
+            <w:r>
+              <w:rPr>
+                <w:sz w:val="18"/>
+                <w:szCs w:val="18"/>
+                <w:lang w:val="en-GB"/>
+              </w:rPr>
+              <w:t>Director DO 1</w:t>
+            </w:r>
+          </w:p>
+          <w:p>
+            <w:pPr>
+              <w:spacing w:before="0"/>
+              <w:ind w:left="0"/>
+              <w:cnfStyle w:val="000000000000" w:firstRow="0" w:lastRow="0" w:firstColumn="0" w:lastColumn="0" w:oddVBand="0" w:evenVBand="0" w:oddHBand="0" w:evenHBand="0" w:firstRowFirstColumn="0" w:firstRowLastColumn="0" w:lastRowFirstColumn="0" w:lastRowLastColumn="0"/>
+              <w:rPr>
+                <w:sz w:val="18"/>
+                <w:szCs w:val="18"/>
+                <w:lang w:val="en-GB"/>
+              </w:rPr>
+            </w:pPr>
+            <w:r>
+              <w:rPr>
+                <w:sz w:val="18"/>
+                <w:szCs w:val="18"/>
+                <w:lang w:val="en-GB"/>
+              </w:rPr>
+              <w:t xml:space="preserve">Nome </w:t>
+            </w:r>
+            <w:r>
+              <w:rPr>
+                <w:sz w:val="18"/>
+                <w:szCs w:val="18"/>
+                <w:lang w:val="en-GB"/>
+              </w:rPr>
+              <w:t>Director DO 2</w:t>
+            </w:r>
+          </w:p>
+        </w:tc>
+        <w:tc>
+          <w:tcPr>
+            <w:tcW w:w="2688" w:type="dxa"/>
+            <w:tcBorders>
+              <w:left w:val="nil"/>
+              <w:right w:val="nil"/>
+            </w:tcBorders>
+            <w:vAlign w:val="center"/>
+          </w:tcPr>
+          <w:p>
+            <w:pPr>
+              <w:spacing w:before="0"/>
+              <w:ind w:left="0"/>
+              <w:cnfStyle w:val="000000000000" w:firstRow="0" w:lastRow="0" w:firstColumn="0" w:lastColumn="0" w:oddVBand="0" w:evenVBand="0" w:oddHBand="0" w:evenHBand="0" w:firstRowFirstColumn="0" w:firstRowLastColumn="0" w:lastRowFirstColumn="0" w:lastRowLastColumn="0"/>
+              <w:rPr>
+                <w:sz w:val="18"/>
+                <w:szCs w:val="18"/>
+              </w:rPr>
+            </w:pPr>
+            <w:r>
+              <w:rPr>
+                <w:sz w:val="18"/>
+                <w:szCs w:val="18"/>
+              </w:rPr>
+              <w:t>Dirección de Execución (DE):</w:t>
+            </w:r>
+          </w:p>
+        </w:tc>
+        <w:tc>
+          <w:tcPr>
+            <w:tcW w:w="2366" w:type="dxa"/>
+            <w:tcBorders>
+              <w:left w:val="nil"/>
+              <w:right w:val="nil"/>
+            </w:tcBorders>
+            <w:vAlign w:val="center"/>
+          </w:tcPr>
+          <w:p>
+            <w:pPr>
+              <w:spacing w:before="0"/>
+              <w:ind w:left="0"/>
+              <w:cnfStyle w:val="000000000000" w:firstRow="0" w:lastRow="0" w:firstColumn="0" w:lastColumn="0" w:oddVBand="0" w:evenVBand="0" w:oddHBand="0" w:evenHBand="0" w:firstRowFirstColumn="0" w:firstRowLastColumn="0" w:lastRowFirstColumn="0" w:lastRowLastColumn="0"/>
+              <w:rPr>
+                <w:sz w:val="18"/>
+                <w:szCs w:val="18"/>
+              </w:rPr>
+            </w:pPr>
+            <w:r>
+              <w:rPr>
+                <w:sz w:val="18"/>
+                <w:szCs w:val="18"/>
+              </w:rPr>
+              <w:t xml:space="preserve">Nome </w:t>
+            </w:r>
+            <w:r>
+              <w:rPr>
+                <w:sz w:val="18"/>
+                <w:szCs w:val="18"/>
+              </w:rPr>
+              <w:t>Director DE</w:t>
             </w:r>
           </w:p>
         </w:tc>
       </w:tr>
       <w:tr>
         <w:trPr>
-          <w:trHeight w:val="397"/>
+          <w:trHeight w:val="510"/>
         </w:trPr>
         <w:tc>
           <w:tcPr>
-            <w:tcW w:w="5245" w:type="dxa"/>
+            <w:cnfStyle w:val="001000000000" w:firstRow="0" w:lastRow="0" w:firstColumn="1" w:lastColumn="0" w:oddVBand="0" w:evenVBand="0" w:oddHBand="0" w:evenHBand="0" w:firstRowFirstColumn="0" w:firstRowLastColumn="0" w:lastRowFirstColumn="0" w:lastRowLastColumn="0"/>
+            <w:tcW w:w="2293" w:type="dxa"/>
             <w:tcBorders>
-              <w:bottom w:val="single" w:sz="2" w:space="0" w:color="E2E8F0"/>
+              <w:left w:val="nil"/>
+              <w:right w:val="nil"/>
             </w:tcBorders>
-            <w:tcMar>
-              <w:top w:w="35" w:type="dxa"/>
-              <w:left w:w="40" w:type="dxa"/>
-              <w:bottom w:w="35" w:type="dxa"/>
-              <w:right w:w="40" w:type="dxa"/>
-            </w:tcMar>
             <w:vAlign w:val="center"/>
           </w:tcPr>
           <w:p>
             <w:pPr>
-              <w:spacing w:before="0" w:after="0"/>
-              <w:ind w:left="107"/>
-              <w:rPr>
-                <w:szCs w:val="20"/>
-              </w:rPr>
-            </w:pPr>
-            <w:r>
-              <w:rPr>
-                <w:color w:val="64748B"/>
-                <w:szCs w:val="20"/>
-              </w:rPr>
-              <w:t xml:space="preserve">Coordinador CSS: </w:t>
-            </w:r>
-            <w:r>
-              <w:rPr>
-                <w:szCs w:val="20"/>
-              </w:rPr>
-              <w:t>Juan Carlos Bello Criado (CSS)</w:t>
-            </w:r>
+              <w:spacing w:before="0"/>
+              <w:ind w:left="0"/>
+              <w:rPr>
+                <w:sz w:val="18"/>
+                <w:szCs w:val="18"/>
+              </w:rPr>
+            </w:pPr>
           </w:p>
         </w:tc>
         <w:tc>
           <w:tcPr>
-            <w:tcW w:w="4597" w:type="dxa"/>
+            <w:tcW w:w="2527" w:type="dxa"/>
             <w:tcBorders>
-              <w:bottom w:val="single" w:sz="2" w:space="0" w:color="E2E8F0"/>
+              <w:left w:val="nil"/>
+              <w:right w:val="nil"/>
             </w:tcBorders>
-            <w:tcMar>
-              <w:top w:w="35" w:type="dxa"/>
-              <w:left w:w="40" w:type="dxa"/>
-              <w:bottom w:w="35" w:type="dxa"/>
-              <w:right w:w="40" w:type="dxa"/>
-            </w:tcMar>
             <w:vAlign w:val="center"/>
           </w:tcPr>
           <w:p>
             <w:pPr>
-              <w:spacing w:before="0" w:after="0"/>
-              <w:ind w:left="107"/>
-              <w:rPr>
-                <w:szCs w:val="20"/>
-              </w:rPr>
-            </w:pPr>
-            <w:r>
-              <w:rPr>
-                <w:color w:val="64748B"/>
-                <w:szCs w:val="20"/>
-              </w:rPr>
-              <w:t xml:space="preserve">Xefe de Obra: </w:t>
-            </w:r>
-            <w:r>
-              <w:rPr>
-                <w:szCs w:val="20"/>
-              </w:rPr>
-              <w:t>Miguel López Rodríguez</w:t>
+              <w:spacing w:before="0"/>
+              <w:ind w:left="0"/>
+              <w:cnfStyle w:val="000000000000" w:firstRow="0" w:lastRow="0" w:firstColumn="0" w:lastColumn="0" w:oddVBand="0" w:evenVBand="0" w:oddHBand="0" w:evenHBand="0" w:firstRowFirstColumn="0" w:firstRowLastColumn="0" w:lastRowFirstColumn="0" w:lastRowLastColumn="0"/>
+              <w:rPr>
+                <w:sz w:val="18"/>
+                <w:szCs w:val="18"/>
+              </w:rPr>
+            </w:pPr>
+          </w:p>
+        </w:tc>
+        <w:tc>
+          <w:tcPr>
+            <w:tcW w:w="2688" w:type="dxa"/>
+            <w:tcBorders>
+              <w:left w:val="nil"/>
+              <w:right w:val="nil"/>
+            </w:tcBorders>
+            <w:vAlign w:val="center"/>
+          </w:tcPr>
+          <w:p>
+            <w:pPr>
+              <w:spacing w:before="0"/>
+              <w:ind w:left="0"/>
+              <w:cnfStyle w:val="000000000000" w:firstRow="0" w:lastRow="0" w:firstColumn="0" w:lastColumn="0" w:oddVBand="0" w:evenVBand="0" w:oddHBand="0" w:evenHBand="0" w:firstRowFirstColumn="0" w:firstRowLastColumn="0" w:lastRowFirstColumn="0" w:lastRowLastColumn="0"/>
+              <w:rPr>
+                <w:sz w:val="18"/>
+                <w:szCs w:val="18"/>
+              </w:rPr>
+            </w:pPr>
+            <w:r>
+              <w:rPr>
+                <w:sz w:val="18"/>
+                <w:szCs w:val="18"/>
+              </w:rPr>
+              <w:t>Coordinador de seguridade e saúde (CSS):</w:t>
+            </w:r>
+          </w:p>
+        </w:tc>
+        <w:tc>
+          <w:tcPr>
+            <w:tcW w:w="2366" w:type="dxa"/>
+            <w:tcBorders>
+              <w:left w:val="nil"/>
+              <w:right w:val="nil"/>
+            </w:tcBorders>
+            <w:vAlign w:val="center"/>
+          </w:tcPr>
+          <w:p>
+            <w:pPr>
+              <w:spacing w:before="0"/>
+              <w:ind w:left="0"/>
+              <w:cnfStyle w:val="000000000000" w:firstRow="0" w:lastRow="0" w:firstColumn="0" w:lastColumn="0" w:oddVBand="0" w:evenVBand="0" w:oddHBand="0" w:evenHBand="0" w:firstRowFirstColumn="0" w:firstRowLastColumn="0" w:lastRowFirstColumn="0" w:lastRowLastColumn="0"/>
+              <w:rPr>
+                <w:sz w:val="18"/>
+                <w:szCs w:val="18"/>
+              </w:rPr>
+            </w:pPr>
+            <w:r>
+              <w:rPr>
+                <w:sz w:val="18"/>
+                <w:szCs w:val="18"/>
+              </w:rPr>
+              <w:t xml:space="preserve">Nome </w:t>
+            </w:r>
+            <w:r>
+              <w:rPr>
+                <w:sz w:val="18"/>
+                <w:szCs w:val="18"/>
+              </w:rPr>
+              <w:t>Coordinador SS</w:t>
+            </w:r>
+          </w:p>
+        </w:tc>
+      </w:tr>
+      <w:tr>
+        <w:trPr>
+          <w:trHeight w:val="510"/>
+        </w:trPr>
+        <w:tc>
+          <w:tcPr>
+            <w:cnfStyle w:val="001000000000" w:firstRow="0" w:lastRow="0" w:firstColumn="1" w:lastColumn="0" w:oddVBand="0" w:evenVBand="0" w:oddHBand="0" w:evenHBand="0" w:firstRowFirstColumn="0" w:firstRowLastColumn="0" w:lastRowFirstColumn="0" w:lastRowLastColumn="0"/>
+            <w:tcW w:w="2293" w:type="dxa"/>
+            <w:tcBorders>
+              <w:left w:val="nil"/>
+              <w:right w:val="nil"/>
+            </w:tcBorders>
+            <w:vAlign w:val="center"/>
+          </w:tcPr>
+          <w:p>
+            <w:pPr>
+              <w:spacing w:before="0"/>
+              <w:ind w:left="0"/>
+              <w:rPr>
+                <w:sz w:val="18"/>
+                <w:szCs w:val="18"/>
+              </w:rPr>
+            </w:pPr>
+            <w:r>
+              <w:rPr>
+                <w:sz w:val="18"/>
+                <w:szCs w:val="18"/>
+              </w:rPr>
+              <w:t>Contratista</w:t>
+            </w:r>
+            <w:r>
+              <w:rPr>
+                <w:sz w:val="18"/>
+                <w:szCs w:val="18"/>
+              </w:rPr>
+              <w:t>:</w:t>
+            </w:r>
+          </w:p>
+        </w:tc>
+        <w:tc>
+          <w:tcPr>
+            <w:tcW w:w="2527" w:type="dxa"/>
+            <w:tcBorders>
+              <w:left w:val="nil"/>
+              <w:right w:val="nil"/>
+            </w:tcBorders>
+            <w:vAlign w:val="center"/>
+          </w:tcPr>
+          <w:p>
+            <w:pPr>
+              <w:spacing w:before="0"/>
+              <w:ind w:left="0"/>
+              <w:cnfStyle w:val="000000000000" w:firstRow="0" w:lastRow="0" w:firstColumn="0" w:lastColumn="0" w:oddVBand="0" w:evenVBand="0" w:oddHBand="0" w:evenHBand="0" w:firstRowFirstColumn="0" w:firstRowLastColumn="0" w:lastRowFirstColumn="0" w:lastRowLastColumn="0"/>
+              <w:rPr>
+                <w:sz w:val="18"/>
+                <w:szCs w:val="18"/>
+              </w:rPr>
+            </w:pPr>
+            <w:r>
+              <w:rPr>
+                <w:sz w:val="18"/>
+                <w:szCs w:val="18"/>
+              </w:rPr>
+              <w:t>Nome contrata</w:t>
+            </w:r>
+          </w:p>
+        </w:tc>
+        <w:tc>
+          <w:tcPr>
+            <w:tcW w:w="2688" w:type="dxa"/>
+            <w:tcBorders>
+              <w:left w:val="nil"/>
+              <w:right w:val="nil"/>
+            </w:tcBorders>
+            <w:vAlign w:val="center"/>
+          </w:tcPr>
+          <w:p>
+            <w:pPr>
+              <w:spacing w:before="0"/>
+              <w:ind w:left="0"/>
+              <w:cnfStyle w:val="000000000000" w:firstRow="0" w:lastRow="0" w:firstColumn="0" w:lastColumn="0" w:oddVBand="0" w:evenVBand="0" w:oddHBand="0" w:evenHBand="0" w:firstRowFirstColumn="0" w:firstRowLastColumn="0" w:lastRowFirstColumn="0" w:lastRowLastColumn="0"/>
+              <w:rPr>
+                <w:sz w:val="18"/>
+                <w:szCs w:val="18"/>
+              </w:rPr>
+            </w:pPr>
+            <w:r>
+              <w:rPr>
+                <w:sz w:val="18"/>
+                <w:szCs w:val="18"/>
+              </w:rPr>
+              <w:t>Xefe de obra (XO):</w:t>
+            </w:r>
+          </w:p>
+        </w:tc>
+        <w:tc>
+          <w:tcPr>
+            <w:tcW w:w="2366" w:type="dxa"/>
+            <w:tcBorders>
+              <w:left w:val="nil"/>
+              <w:right w:val="nil"/>
+            </w:tcBorders>
+            <w:vAlign w:val="center"/>
+          </w:tcPr>
+          <w:p>
+            <w:pPr>
+              <w:spacing w:before="0"/>
+              <w:ind w:left="0"/>
+              <w:cnfStyle w:val="000000000000" w:firstRow="0" w:lastRow="0" w:firstColumn="0" w:lastColumn="0" w:oddVBand="0" w:evenVBand="0" w:oddHBand="0" w:evenHBand="0" w:firstRowFirstColumn="0" w:firstRowLastColumn="0" w:lastRowFirstColumn="0" w:lastRowLastColumn="0"/>
+              <w:rPr>
+                <w:sz w:val="18"/>
+                <w:szCs w:val="18"/>
+              </w:rPr>
+            </w:pPr>
+            <w:r>
+              <w:rPr>
+                <w:sz w:val="18"/>
+                <w:szCs w:val="18"/>
+              </w:rPr>
+              <w:t>Nome Xefe de Obra</w:t>
             </w:r>
           </w:p>
         </w:tc>
@@ -478,34 +706,40 @@
           <w:tcPr>
             <w:cnfStyle w:val="001000000000" w:firstRow="0" w:lastRow="0" w:firstColumn="1" w:lastColumn="0" w:oddVBand="0" w:evenVBand="0" w:oddHBand="0" w:evenHBand="0" w:firstRowFirstColumn="0" w:firstRowLastColumn="0" w:lastRowFirstColumn="0" w:lastRowLastColumn="0"/>
             <w:tcW w:w="3402" w:type="dxa"/>
+            <w:tcBorders>
+              <w:top w:val="nil"/>
+              <w:left w:val="nil"/>
+              <w:right w:val="nil"/>
+            </w:tcBorders>
             <w:vAlign w:val="center"/>
           </w:tcPr>
           <w:p>
             <w:pPr>
               <w:spacing w:before="0"/>
               <w:ind w:left="107"/>
+              <w:rPr>
+                <w:sz w:val="18"/>
+                <w:szCs w:val="28"/>
+              </w:rPr>
             </w:pPr>
             <w:r>
               <w:rPr>
                 <w:color w:val="475569"/>
-                <w:sz w:val="17"/>
-              </w:rPr>
-              <w:t xml:space="preserve">Nome e </w:t>
-            </w:r>
-            <w:proofErr w:type="spellStart"/>
-            <w:r>
-              <w:rPr>
-                <w:color w:val="475569"/>
-                <w:sz w:val="17"/>
-              </w:rPr>
-              <w:t>Apelidos</w:t>
-            </w:r>
-            <w:proofErr w:type="spellEnd"/>
+                <w:sz w:val="18"/>
+                <w:szCs w:val="28"/>
+              </w:rPr>
+              <w:t>Nome e Apelidos</w:t>
+            </w:r>
           </w:p>
         </w:tc>
         <w:tc>
           <w:tcPr>
             <w:tcW w:w="3544" w:type="dxa"/>
+            <w:tcBorders>
+              <w:top w:val="nil"/>
+              <w:left w:val="nil"/>
+              <w:right w:val="nil"/>
+            </w:tcBorders>
             <w:vAlign w:val="center"/>
           </w:tcPr>
           <w:p>
@@ -513,11 +747,16 @@
               <w:spacing w:before="0"/>
               <w:ind w:left="107"/>
               <w:cnfStyle w:val="100000000000" w:firstRow="1" w:lastRow="0" w:firstColumn="0" w:lastColumn="0" w:oddVBand="0" w:evenVBand="0" w:oddHBand="0" w:evenHBand="0" w:firstRowFirstColumn="0" w:firstRowLastColumn="0" w:lastRowFirstColumn="0" w:lastRowLastColumn="0"/>
+              <w:rPr>
+                <w:sz w:val="18"/>
+                <w:szCs w:val="28"/>
+              </w:rPr>
             </w:pPr>
             <w:r>
               <w:rPr>
                 <w:color w:val="475569"/>
-                <w:sz w:val="17"/>
+                <w:sz w:val="18"/>
+                <w:szCs w:val="28"/>
               </w:rPr>
               <w:t>Cargo / Función</w:t>
             </w:r>
@@ -526,6 +765,11 @@
         <w:tc>
           <w:tcPr>
             <w:tcW w:w="2835" w:type="dxa"/>
+            <w:tcBorders>
+              <w:top w:val="nil"/>
+              <w:left w:val="nil"/>
+              <w:right w:val="nil"/>
+            </w:tcBorders>
             <w:vAlign w:val="center"/>
           </w:tcPr>
           <w:p>
@@ -533,11 +777,16 @@
               <w:spacing w:before="0"/>
               <w:ind w:left="107"/>
               <w:cnfStyle w:val="100000000000" w:firstRow="1" w:lastRow="0" w:firstColumn="0" w:lastColumn="0" w:oddVBand="0" w:evenVBand="0" w:oddHBand="0" w:evenHBand="0" w:firstRowFirstColumn="0" w:firstRowLastColumn="0" w:lastRowFirstColumn="0" w:lastRowLastColumn="0"/>
+              <w:rPr>
+                <w:sz w:val="18"/>
+                <w:szCs w:val="28"/>
+              </w:rPr>
             </w:pPr>
             <w:r>
               <w:rPr>
                 <w:color w:val="475569"/>
-                <w:sz w:val="17"/>
+                <w:sz w:val="18"/>
+                <w:szCs w:val="28"/>
               </w:rPr>
               <w:t>Entidade Representada</w:t>
             </w:r>
@@ -552,17 +801,26 @@
           <w:tcPr>
             <w:cnfStyle w:val="001000000000" w:firstRow="0" w:lastRow="0" w:firstColumn="1" w:lastColumn="0" w:oddVBand="0" w:evenVBand="0" w:oddHBand="0" w:evenHBand="0" w:firstRowFirstColumn="0" w:firstRowLastColumn="0" w:lastRowFirstColumn="0" w:lastRowLastColumn="0"/>
             <w:tcW w:w="3402" w:type="dxa"/>
+            <w:tcBorders>
+              <w:left w:val="nil"/>
+              <w:right w:val="nil"/>
+            </w:tcBorders>
             <w:vAlign w:val="center"/>
           </w:tcPr>
           <w:p>
             <w:pPr>
               <w:spacing w:before="0"/>
               <w:ind w:left="107"/>
+              <w:rPr>
+                <w:sz w:val="18"/>
+                <w:szCs w:val="28"/>
+              </w:rPr>
             </w:pPr>
             <w:r>
               <w:rPr>
                 <w:color w:val="0F172A"/>
-                <w:sz w:val="17"/>
+                <w:sz w:val="18"/>
+                <w:szCs w:val="28"/>
               </w:rPr>
               <w:t>María José González Novo</w:t>
             </w:r>
@@ -571,6 +829,10 @@
         <w:tc>
           <w:tcPr>
             <w:tcW w:w="3544" w:type="dxa"/>
+            <w:tcBorders>
+              <w:left w:val="nil"/>
+              <w:right w:val="nil"/>
+            </w:tcBorders>
             <w:vAlign w:val="center"/>
           </w:tcPr>
           <w:p>
@@ -578,11 +840,16 @@
               <w:spacing w:before="0"/>
               <w:ind w:left="107"/>
               <w:cnfStyle w:val="000000000000" w:firstRow="0" w:lastRow="0" w:firstColumn="0" w:lastColumn="0" w:oddVBand="0" w:evenVBand="0" w:oddHBand="0" w:evenHBand="0" w:firstRowFirstColumn="0" w:firstRowLastColumn="0" w:lastRowFirstColumn="0" w:lastRowLastColumn="0"/>
+              <w:rPr>
+                <w:sz w:val="18"/>
+                <w:szCs w:val="28"/>
+              </w:rPr>
             </w:pPr>
             <w:r>
               <w:rPr>
                 <w:color w:val="475569"/>
-                <w:sz w:val="17"/>
+                <w:sz w:val="18"/>
+                <w:szCs w:val="28"/>
               </w:rPr>
               <w:t>Arquitecta Municipal</w:t>
             </w:r>
@@ -591,6 +858,10 @@
         <w:tc>
           <w:tcPr>
             <w:tcW w:w="2835" w:type="dxa"/>
+            <w:tcBorders>
+              <w:left w:val="nil"/>
+              <w:right w:val="nil"/>
+            </w:tcBorders>
             <w:vAlign w:val="center"/>
           </w:tcPr>
           <w:p>
@@ -598,11 +869,16 @@
               <w:spacing w:before="0"/>
               <w:ind w:left="107"/>
               <w:cnfStyle w:val="000000000000" w:firstRow="0" w:lastRow="0" w:firstColumn="0" w:lastColumn="0" w:oddVBand="0" w:evenVBand="0" w:oddHBand="0" w:evenHBand="0" w:firstRowFirstColumn="0" w:firstRowLastColumn="0" w:lastRowFirstColumn="0" w:lastRowLastColumn="0"/>
+              <w:rPr>
+                <w:sz w:val="18"/>
+                <w:szCs w:val="28"/>
+              </w:rPr>
             </w:pPr>
             <w:r>
               <w:rPr>
                 <w:color w:val="64748B"/>
-                <w:sz w:val="17"/>
+                <w:sz w:val="18"/>
+                <w:szCs w:val="28"/>
               </w:rPr>
               <w:t>Concello de Ferrol</w:t>
             </w:r>
@@ -617,17 +893,26 @@
           <w:tcPr>
             <w:cnfStyle w:val="001000000000" w:firstRow="0" w:lastRow="0" w:firstColumn="1" w:lastColumn="0" w:oddVBand="0" w:evenVBand="0" w:oddHBand="0" w:evenHBand="0" w:firstRowFirstColumn="0" w:firstRowLastColumn="0" w:lastRowFirstColumn="0" w:lastRowLastColumn="0"/>
             <w:tcW w:w="3402" w:type="dxa"/>
+            <w:tcBorders>
+              <w:left w:val="nil"/>
+              <w:right w:val="nil"/>
+            </w:tcBorders>
             <w:vAlign w:val="center"/>
           </w:tcPr>
           <w:p>
             <w:pPr>
               <w:spacing w:before="0"/>
               <w:ind w:left="107"/>
+              <w:rPr>
+                <w:sz w:val="18"/>
+                <w:szCs w:val="28"/>
+              </w:rPr>
             </w:pPr>
             <w:r>
               <w:rPr>
                 <w:color w:val="0F172A"/>
-                <w:sz w:val="17"/>
+                <w:sz w:val="18"/>
+                <w:szCs w:val="28"/>
               </w:rPr>
               <w:t>Rosa Vilas Romalde</w:t>
             </w:r>
@@ -636,6 +921,10 @@
         <w:tc>
           <w:tcPr>
             <w:tcW w:w="3544" w:type="dxa"/>
+            <w:tcBorders>
+              <w:left w:val="nil"/>
+              <w:right w:val="nil"/>
+            </w:tcBorders>
             <w:vAlign w:val="center"/>
           </w:tcPr>
           <w:p>
@@ -643,11 +932,16 @@
               <w:spacing w:before="0"/>
               <w:ind w:left="107"/>
               <w:cnfStyle w:val="000000000000" w:firstRow="0" w:lastRow="0" w:firstColumn="0" w:lastColumn="0" w:oddVBand="0" w:evenVBand="0" w:oddHBand="0" w:evenHBand="0" w:firstRowFirstColumn="0" w:firstRowLastColumn="0" w:lastRowFirstColumn="0" w:lastRowLastColumn="0"/>
+              <w:rPr>
+                <w:sz w:val="18"/>
+                <w:szCs w:val="28"/>
+              </w:rPr>
             </w:pPr>
             <w:r>
               <w:rPr>
                 <w:color w:val="475569"/>
-                <w:sz w:val="17"/>
+                <w:sz w:val="18"/>
+                <w:szCs w:val="28"/>
               </w:rPr>
               <w:t>Arquitecta Directora de Obra</w:t>
             </w:r>
@@ -656,6 +950,10 @@
         <w:tc>
           <w:tcPr>
             <w:tcW w:w="2835" w:type="dxa"/>
+            <w:tcBorders>
+              <w:left w:val="nil"/>
+              <w:right w:val="nil"/>
+            </w:tcBorders>
             <w:vAlign w:val="center"/>
           </w:tcPr>
           <w:p>
@@ -663,11 +961,16 @@
               <w:spacing w:before="0"/>
               <w:ind w:left="107"/>
               <w:cnfStyle w:val="000000000000" w:firstRow="0" w:lastRow="0" w:firstColumn="0" w:lastColumn="0" w:oddVBand="0" w:evenVBand="0" w:oddHBand="0" w:evenHBand="0" w:firstRowFirstColumn="0" w:firstRowLastColumn="0" w:lastRowFirstColumn="0" w:lastRowLastColumn="0"/>
+              <w:rPr>
+                <w:sz w:val="18"/>
+                <w:szCs w:val="28"/>
+              </w:rPr>
             </w:pPr>
             <w:r>
               <w:rPr>
                 <w:color w:val="64748B"/>
-                <w:sz w:val="17"/>
+                <w:sz w:val="18"/>
+                <w:szCs w:val="28"/>
               </w:rPr>
               <w:t>Dirección Facultativa</w:t>
             </w:r>
@@ -682,17 +985,26 @@
           <w:tcPr>
             <w:cnfStyle w:val="001000000000" w:firstRow="0" w:lastRow="0" w:firstColumn="1" w:lastColumn="0" w:oddVBand="0" w:evenVBand="0" w:oddHBand="0" w:evenHBand="0" w:firstRowFirstColumn="0" w:firstRowLastColumn="0" w:lastRowFirstColumn="0" w:lastRowLastColumn="0"/>
             <w:tcW w:w="3402" w:type="dxa"/>
+            <w:tcBorders>
+              <w:left w:val="nil"/>
+              <w:right w:val="nil"/>
+            </w:tcBorders>
             <w:vAlign w:val="center"/>
           </w:tcPr>
           <w:p>
             <w:pPr>
               <w:spacing w:before="0"/>
               <w:ind w:left="107"/>
+              <w:rPr>
+                <w:sz w:val="18"/>
+                <w:szCs w:val="28"/>
+              </w:rPr>
             </w:pPr>
             <w:r>
               <w:rPr>
                 <w:color w:val="0F172A"/>
-                <w:sz w:val="17"/>
+                <w:sz w:val="18"/>
+                <w:szCs w:val="28"/>
               </w:rPr>
               <w:t>Sergio Beceiro Lodeiro</w:t>
             </w:r>
@@ -701,6 +1013,10 @@
         <w:tc>
           <w:tcPr>
             <w:tcW w:w="3544" w:type="dxa"/>
+            <w:tcBorders>
+              <w:left w:val="nil"/>
+              <w:right w:val="nil"/>
+            </w:tcBorders>
             <w:vAlign w:val="center"/>
           </w:tcPr>
           <w:p>
@@ -708,11 +1024,16 @@
               <w:spacing w:before="0"/>
               <w:ind w:left="107"/>
               <w:cnfStyle w:val="000000000000" w:firstRow="0" w:lastRow="0" w:firstColumn="0" w:lastColumn="0" w:oddVBand="0" w:evenVBand="0" w:oddHBand="0" w:evenHBand="0" w:firstRowFirstColumn="0" w:firstRowLastColumn="0" w:lastRowFirstColumn="0" w:lastRowLastColumn="0"/>
+              <w:rPr>
+                <w:sz w:val="18"/>
+                <w:szCs w:val="28"/>
+              </w:rPr>
             </w:pPr>
             <w:r>
               <w:rPr>
                 <w:color w:val="475569"/>
-                <w:sz w:val="17"/>
+                <w:sz w:val="18"/>
+                <w:szCs w:val="28"/>
               </w:rPr>
               <w:t>Arquitecto Director de Obra</w:t>
             </w:r>
@@ -721,6 +1042,10 @@
         <w:tc>
           <w:tcPr>
             <w:tcW w:w="2835" w:type="dxa"/>
+            <w:tcBorders>
+              <w:left w:val="nil"/>
+              <w:right w:val="nil"/>
+            </w:tcBorders>
             <w:vAlign w:val="center"/>
           </w:tcPr>
           <w:p>
@@ -728,11 +1053,16 @@
               <w:spacing w:before="0"/>
               <w:ind w:left="107"/>
               <w:cnfStyle w:val="000000000000" w:firstRow="0" w:lastRow="0" w:firstColumn="0" w:lastColumn="0" w:oddVBand="0" w:evenVBand="0" w:oddHBand="0" w:evenHBand="0" w:firstRowFirstColumn="0" w:firstRowLastColumn="0" w:lastRowFirstColumn="0" w:lastRowLastColumn="0"/>
+              <w:rPr>
+                <w:sz w:val="18"/>
+                <w:szCs w:val="28"/>
+              </w:rPr>
             </w:pPr>
             <w:r>
               <w:rPr>
                 <w:color w:val="64748B"/>
-                <w:sz w:val="17"/>
+                <w:sz w:val="18"/>
+                <w:szCs w:val="28"/>
               </w:rPr>
               <w:t>Dirección Facultativa</w:t>
             </w:r>
@@ -747,17 +1077,26 @@
           <w:tcPr>
             <w:cnfStyle w:val="001000000000" w:firstRow="0" w:lastRow="0" w:firstColumn="1" w:lastColumn="0" w:oddVBand="0" w:evenVBand="0" w:oddHBand="0" w:evenHBand="0" w:firstRowFirstColumn="0" w:firstRowLastColumn="0" w:lastRowFirstColumn="0" w:lastRowLastColumn="0"/>
             <w:tcW w:w="3402" w:type="dxa"/>
+            <w:tcBorders>
+              <w:left w:val="nil"/>
+              <w:right w:val="nil"/>
+            </w:tcBorders>
             <w:vAlign w:val="center"/>
           </w:tcPr>
           <w:p>
             <w:pPr>
               <w:spacing w:before="0"/>
               <w:ind w:left="107"/>
+              <w:rPr>
+                <w:sz w:val="18"/>
+                <w:szCs w:val="28"/>
+              </w:rPr>
             </w:pPr>
             <w:r>
               <w:rPr>
                 <w:color w:val="0F172A"/>
-                <w:sz w:val="17"/>
+                <w:sz w:val="18"/>
+                <w:szCs w:val="28"/>
               </w:rPr>
               <w:t>Ana Gallego Núñez</w:t>
             </w:r>
@@ -766,6 +1105,10 @@
         <w:tc>
           <w:tcPr>
             <w:tcW w:w="3544" w:type="dxa"/>
+            <w:tcBorders>
+              <w:left w:val="nil"/>
+              <w:right w:val="nil"/>
+            </w:tcBorders>
             <w:vAlign w:val="center"/>
           </w:tcPr>
           <w:p>
@@ -773,11 +1116,16 @@
               <w:spacing w:before="0"/>
               <w:ind w:left="107"/>
               <w:cnfStyle w:val="000000000000" w:firstRow="0" w:lastRow="0" w:firstColumn="0" w:lastColumn="0" w:oddVBand="0" w:evenVBand="0" w:oddHBand="0" w:evenHBand="0" w:firstRowFirstColumn="0" w:firstRowLastColumn="0" w:lastRowFirstColumn="0" w:lastRowLastColumn="0"/>
+              <w:rPr>
+                <w:sz w:val="18"/>
+                <w:szCs w:val="28"/>
+              </w:rPr>
             </w:pPr>
             <w:r>
               <w:rPr>
                 <w:color w:val="475569"/>
-                <w:sz w:val="17"/>
+                <w:sz w:val="18"/>
+                <w:szCs w:val="28"/>
               </w:rPr>
               <w:t>Directora de ejecución</w:t>
             </w:r>
@@ -786,6 +1134,10 @@
         <w:tc>
           <w:tcPr>
             <w:tcW w:w="2835" w:type="dxa"/>
+            <w:tcBorders>
+              <w:left w:val="nil"/>
+              <w:right w:val="nil"/>
+            </w:tcBorders>
             <w:vAlign w:val="center"/>
           </w:tcPr>
           <w:p>
@@ -793,11 +1145,16 @@
               <w:spacing w:before="0"/>
               <w:ind w:left="107"/>
               <w:cnfStyle w:val="000000000000" w:firstRow="0" w:lastRow="0" w:firstColumn="0" w:lastColumn="0" w:oddVBand="0" w:evenVBand="0" w:oddHBand="0" w:evenHBand="0" w:firstRowFirstColumn="0" w:firstRowLastColumn="0" w:lastRowFirstColumn="0" w:lastRowLastColumn="0"/>
+              <w:rPr>
+                <w:sz w:val="18"/>
+                <w:szCs w:val="28"/>
+              </w:rPr>
             </w:pPr>
             <w:r>
               <w:rPr>
                 <w:color w:val="64748B"/>
-                <w:sz w:val="17"/>
+                <w:sz w:val="18"/>
+                <w:szCs w:val="28"/>
               </w:rPr>
               <w:t>DEM</w:t>
             </w:r>
@@ -831,23 +1188,7 @@
     </w:p>
     <w:p>
       <w:r>
-        <w:t>Se recibe en obra, muestra de hoja de carpintería exterior en iroko y con marco normalizado. Se solicita y se enviará por parte de la empresa de carpintería, los detalles de los marcos, documentación de calidad, ensayos y características técnicas de todos los componentes (marco, vidrio, herrajes, tratamientos, etc</w:t>
-      </w:r>
-      <w:proofErr w:type="gramStart"/>
-      <w:r>
-        <w:t>).Se</w:t>
-      </w:r>
-      <w:proofErr w:type="gramEnd"/>
-      <w:r>
-        <w:t xml:space="preserve"> toman medidas de las mochetas para ajustar los marcos de </w:t>
-      </w:r>
-      <w:proofErr w:type="gramStart"/>
-      <w:r>
-        <w:t>carpintería.La</w:t>
-      </w:r>
-      <w:proofErr w:type="gramEnd"/>
-      <w:r>
-        <w:t xml:space="preserve"> carpintería exterior será color marrón igual al existente en la torre del s. XIX.</w:t>
+        <w:t>Se recibe en obra, muestra de hoja de carpintería exterior en iroko y con marco normalizado. Se solicita y se enviará por parte de la empresa de carpintería, los detalles de los marcos, documentación de calidad, ensayos y características técnicas de todos los componentes (marco, vidrio, herrajes, tratamientos, etc).Se toman medidas de las mochetas para ajustar los marcos de carpintería.La carpintería exterior será color marrón igual al existente en la torre del s. XIX.</w:t>
       </w:r>
     </w:p>
     <w:p>
@@ -860,31 +1201,7 @@
     </w:p>
     <w:p>
       <w:r>
-        <w:t xml:space="preserve">Después del picado del enfoscado de mortero de cemento de la parte alta aparece el trabatel original, se solicita a la empresa constructora el levantamiento de una platilla </w:t>
-      </w:r>
-      <w:proofErr w:type="gramStart"/>
-      <w:r>
-        <w:t>del mismo</w:t>
-      </w:r>
-      <w:proofErr w:type="gramEnd"/>
-      <w:r>
-        <w:t xml:space="preserve"> y se solicita que se continue retirando los morteros de cemento para su </w:t>
-      </w:r>
-      <w:proofErr w:type="gramStart"/>
-      <w:r>
-        <w:t>recuperación.Se</w:t>
-      </w:r>
-      <w:proofErr w:type="gramEnd"/>
-      <w:r>
-        <w:t xml:space="preserve"> sacarán las líneas de replanteo de la </w:t>
-      </w:r>
-      <w:proofErr w:type="gramStart"/>
-      <w:r>
-        <w:t>cubierta.Se</w:t>
-      </w:r>
-      <w:proofErr w:type="gramEnd"/>
-      <w:r>
-        <w:t xml:space="preserve"> recibe valoración en cuanto a medición del desmontado de la parte superior del muro de fachada que se encuentra muy desplomado. Se aprueba y se medirá en las partidas 3.2.8 de desmontaje y la partida 4.1.3 de realización de muro.</w:t>
+        <w:t>Después del picado del enfoscado de mortero de cemento de la parte alta aparece el trabatel original, se solicita a la empresa constructora el levantamiento de una platilla del mismo y se solicita que se continue retirando los morteros de cemento para su recuperación.Se sacarán las líneas de replanteo de la cubierta.Se recibe valoración en cuanto a medición del desmontado de la parte superior del muro de fachada que se encuentra muy desplomado. Se aprueba y se medirá en las partidas 3.2.8 de desmontaje y la partida 4.1.3 de realización de muro.</w:t>
       </w:r>
     </w:p>
     <w:p>
@@ -897,15 +1214,7 @@
     </w:p>
     <w:p>
       <w:r>
-        <w:t xml:space="preserve">Para el </w:t>
-      </w:r>
-      <w:proofErr w:type="spellStart"/>
-      <w:r>
-        <w:t>caviti</w:t>
-      </w:r>
-      <w:proofErr w:type="spellEnd"/>
-      <w:r>
-        <w:t>, se recibe ficha técnica de caviti “Granchio”. Se comprueba que las resistencias son adecuadas.</w:t>
+        <w:t>Para el caviti, se recibe ficha técnica de caviti “Granchio”. Se comprueba que las resistencias son adecuadas.</w:t>
       </w:r>
     </w:p>
     <w:p>
@@ -919,15 +1228,7 @@
     </w:p>
     <w:p>
       <w:r>
-        <w:t xml:space="preserve">En zona de </w:t>
-      </w:r>
-      <w:proofErr w:type="spellStart"/>
-      <w:r>
-        <w:t>lareira</w:t>
-      </w:r>
-      <w:proofErr w:type="spellEnd"/>
-      <w:r>
-        <w:t>, se encintará la piedra de cantería y se enfoscará el resto. La DF marcará exactamente que piedras a encintar.</w:t>
+        <w:t>En zona de lareira, se encintará la piedra de cantería y se enfoscará el resto. La DF marcará exactamente que piedras a encintar.</w:t>
       </w:r>
     </w:p>
     <w:p>
@@ -953,15 +1254,7 @@
     </w:p>
     <w:p>
       <w:r>
-        <w:t xml:space="preserve">Pendiente de consulta al Servizo do Patrimonio Cultural el pavimento de la zona derecha. La DF ya tiene una solución a proponer.En el volumen derecho, donde está el muro original del castillo. Se consolidará el existente.Pendiente de consulta al Servizo do Patrimonio Cultural del pequeño acabado del suelo del pozo aparecido en las caballerizas. La DF ya tiene una solución a proponer, pendiente de enviar la fotogrametría el arqueólogo.Decisión sobre la excavación con medidas de seguridad de la fosa séptica. Consultado por el arqueólogo de la obra al Servizo do Patrimonio Cultural puede realizarse la excavación de forma no manual, dada su peligrosidad, pero deberá estar presente cuando se realice la misma.Ante los restos aparecidos la solución principal será no injerir en los mismos, no actuando sobre ellos, separándose y protegerlos según indicaciones del Servizo do Patrimonio Cultural. </w:t>
-      </w:r>
-      <w:proofErr w:type="gramStart"/>
-      <w:r>
-        <w:t>Indicar</w:t>
-      </w:r>
-      <w:proofErr w:type="gramEnd"/>
-      <w:r>
-        <w:t xml:space="preserve"> que, con esta solución, no se retrasan los trabajos en obra.</w:t>
+        <w:t>Pendiente de consulta al Servizo do Patrimonio Cultural el pavimento de la zona derecha. La DF ya tiene una solución a proponer.En el volumen derecho, donde está el muro original del castillo. Se consolidará el existente.Pendiente de consulta al Servizo do Patrimonio Cultural del pequeño acabado del suelo del pozo aparecido en las caballerizas. La DF ya tiene una solución a proponer, pendiente de enviar la fotogrametría el arqueólogo.Decisión sobre la excavación con medidas de seguridad de la fosa séptica. Consultado por el arqueólogo de la obra al Servizo do Patrimonio Cultural puede realizarse la excavación de forma no manual, dada su peligrosidad, pero deberá estar presente cuando se realice la misma.Ante los restos aparecidos la solución principal será no injerir en los mismos, no actuando sobre ellos, separándose y protegerlos según indicaciones del Servizo do Patrimonio Cultural. Indicar que, con esta solución, no se retrasan los trabajos en obra.</w:t>
       </w:r>
     </w:p>
     <w:p>
@@ -982,15 +1275,7 @@
     </w:p>
     <w:p>
       <w:r>
-        <w:t>Se recuerda por parte del Coordinador de Seguridad y salud, a los trabajadores que deben de utilizar los EPIS establecidos durante los trabajos que se está llevando a cabo (gafas, guantes, mascarillas, …</w:t>
-      </w:r>
-      <w:proofErr w:type="gramStart"/>
-      <w:r>
-        <w:t>).Se</w:t>
-      </w:r>
-      <w:proofErr w:type="gramEnd"/>
-      <w:r>
-        <w:t xml:space="preserve"> recuerda que todos los agentes que intervienen en la obra deben de evitar circular pegados a los muros de carga, por precaución ante cualquier desprendimiento de estos, mientras no estén consolidados. En el caso de tener que trabajar al pié de uno de estos muros no consolidado, se montará una marquesina para proteger al/a los trabajador/es.Se ordena que los trabajadores que están trabajando en la coronación de los muros, lleven arnés y estén sujetos a una línea de vida.Se recuerda que deben de ser revisados antes de iniciar los trabajos diariamente, el estado de los andamios y de las líneas de vida.Se recuerda que no se puede trabajar debajo de la chimenea de fibrocemento y la fábrica de ladrillo que la recubre, hasta que se retire la chimenea.</w:t>
+        <w:t>Se recuerda por parte del Coordinador de Seguridad y salud, a los trabajadores que deben de utilizar los EPIS establecidos durante los trabajos que se está llevando a cabo (gafas, guantes, mascarillas, …).Se recuerda que todos los agentes que intervienen en la obra deben de evitar circular pegados a los muros de carga, por precaución ante cualquier desprendimiento de estos, mientras no estén consolidados. En el caso de tener que trabajar al pié de uno de estos muros no consolidado, se montará una marquesina para proteger al/a los trabajador/es.Se ordena que los trabajadores que están trabajando en la coronación de los muros, lleven arnés y estén sujetos a una línea de vida.Se recuerda que deben de ser revisados antes de iniciar los trabajos diariamente, el estado de los andamios y de las líneas de vida.Se recuerda que no se puede trabajar debajo de la chimenea de fibrocemento y la fábrica de ladrillo que la recubre, hasta que se retire la chimenea.</w:t>
       </w:r>
     </w:p>
     <w:p>
@@ -1033,23 +1318,7 @@
     </w:p>
     <w:p>
       <w:r>
-        <w:t xml:space="preserve">• Se recuerda que todos los agentes que intervienen en la obra deben de evitar circular pegados a los muros de carga, por precaución ante cualquier desprendimiento de estos, mientras no estén consolidados. En el caso de tener que trabajar al </w:t>
-      </w:r>
-      <w:proofErr w:type="spellStart"/>
-      <w:r>
-        <w:t>pié</w:t>
-      </w:r>
-      <w:proofErr w:type="spellEnd"/>
-      <w:r>
-        <w:t xml:space="preserve"> de uno de estos muros no consolidado, se montará una marquesina para proteger al/</w:t>
-      </w:r>
-      <w:proofErr w:type="gramStart"/>
-      <w:r>
-        <w:t>a los trabajador</w:t>
-      </w:r>
-      <w:proofErr w:type="gramEnd"/>
-      <w:r>
-        <w:t>/es.</w:t>
+        <w:t>• Se recuerda que todos los agentes que intervienen en la obra deben de evitar circular pegados a los muros de carga, por precaución ante cualquier desprendimiento de estos, mientras no estén consolidados. En el caso de tener que trabajar al pié de uno de estos muros no consolidado, se montará una marquesina para proteger al/a los trabajador/es.</w:t>
       </w:r>
     </w:p>
     <w:p>
@@ -1097,15 +1366,7 @@
     </w:p>
     <w:p>
       <w:r>
-        <w:t xml:space="preserve">• Se continúa con el retacado de muros de </w:t>
-      </w:r>
-      <w:proofErr w:type="spellStart"/>
-      <w:r>
-        <w:t>cachotería</w:t>
-      </w:r>
-      <w:proofErr w:type="spellEnd"/>
-      <w:r>
-        <w:t xml:space="preserve"> por la cara interior.</w:t>
+        <w:t>• Se continúa con el retacado de muros de cachotería por la cara interior.</w:t>
       </w:r>
     </w:p>
     <w:p>
@@ -1475,21 +1736,12 @@
         <w:szCs w:val="16"/>
       </w:rPr>
     </w:pPr>
-    <w:proofErr w:type="spellStart"/>
     <w:r>
       <w:rPr>
         <w:sz w:val="16"/>
         <w:szCs w:val="16"/>
       </w:rPr>
-      <w:t>Páxina</w:t>
-    </w:r>
-    <w:proofErr w:type="spellEnd"/>
-    <w:r>
-      <w:rPr>
-        <w:sz w:val="16"/>
-        <w:szCs w:val="16"/>
-      </w:rPr>
-      <w:t xml:space="preserve"> </w:t>
+      <w:t xml:space="preserve">Páxina </w:t>
     </w:r>
     <w:r>
       <w:rPr>
@@ -1659,15 +1911,7 @@
             <w:ind w:left="0"/>
           </w:pPr>
           <w:r>
-            <w:t xml:space="preserve">Refundido de actuaciones en el castillo de San Felipe, en el marco del plan de recuperación, transformación y resiliencia –financiado por la Unión Europea – Next </w:t>
-          </w:r>
-          <w:proofErr w:type="spellStart"/>
-          <w:r>
-            <w:t>Generation</w:t>
-          </w:r>
-          <w:proofErr w:type="spellEnd"/>
-          <w:r>
-            <w:t xml:space="preserve"> EU</w:t>
+            <w:t>Refundido de actuaciones en el castillo de San Felipe, en el marco del plan de recuperación, transformación y resiliencia –financiado por la Unión Europea – Next Generation EU</w:t>
           </w:r>
         </w:p>
         <w:p>
@@ -1788,6 +2032,92 @@
 <file path=word/numbering.xml><?xml version="1.0" encoding="utf-8"?>
 <w:numbering xmlns:wpc="http://schemas.microsoft.com/office/word/2010/wordprocessingCanvas" xmlns:cx="http://schemas.microsoft.com/office/drawing/2014/chartex" xmlns:cx1="http://schemas.microsoft.com/office/drawing/2015/9/8/chartex" xmlns:cx2="http://schemas.microsoft.com/office/drawing/2015/10/21/chartex" xmlns:cx3="http://schemas.microsoft.com/office/drawing/2016/5/9/chartex" xmlns:cx4="http://schemas.microsoft.com/office/drawing/2016/5/10/chartex" xmlns:cx5="http://schemas.microsoft.com/office/drawing/2016/5/11/chartex" xmlns:cx6="http://schemas.microsoft.com/office/drawing/2016/5/12/chartex" xmlns:cx7="http://schemas.microsoft.com/office/drawing/2016/5/13/chartex" xmlns:cx8="http://schemas.microsoft.com/office/drawing/2016/5/14/chartex" xmlns:mc="http://schemas.openxmlformats.org/markup-compatibility/2006" xmlns:aink="http://schemas.microsoft.com/office/drawing/2016/ink" xmlns:am3d="http://schemas.microsoft.com/office/drawing/2017/model3d" xmlns:o="urn:schemas-microsoft-com:office:office" xmlns:oel="http://schemas.microsoft.com/office/2019/extlst" xmlns:r="http://schemas.openxmlformats.org/officeDocument/2006/relationships" xmlns:m="http://schemas.openxmlformats.org/officeDocument/2006/math" xmlns:v="urn:schemas-microsoft-com:vml" xmlns:wp14="http://schemas.microsoft.com/office/word/2010/wordprocessingDrawing" xmlns:wp="http://schemas.openxmlformats.org/drawingml/2006/wordprocessingDrawing" xmlns:w10="urn:schemas-microsoft-com:office:word" xmlns:w="http://schemas.openxmlformats.org/wordprocessingml/2006/main" xmlns:w14="http://schemas.microsoft.com/office/word/2010/wordml" xmlns:w15="http://schemas.microsoft.com/office/word/2012/wordml" xmlns:w16cex="http://schemas.microsoft.com/office/word/2018/wordml/cex" xmlns:w16cid="http://schemas.microsoft.com/office/word/2016/wordml/cid" xmlns:w16="http://schemas.microsoft.com/office/word/2018/wordml" xmlns:w16du="http://schemas.microsoft.com/office/word/2023/wordml/word16du" xmlns:w16sdtdh="http://schemas.microsoft.com/office/word/2020/wordml/sdtdatahash" xmlns:w16sdtfl="http://schemas.microsoft.com/office/word/2024/wordml/sdtformatlock" xmlns:w16se="http://schemas.microsoft.com/office/word/2015/wordml/symex" xmlns:wpg="http://schemas.microsoft.com/office/word/2010/wordprocessingGroup" xmlns:wpi="http://schemas.microsoft.com/office/word/2010/wordprocessingInk" xmlns:wne="http://schemas.microsoft.com/office/word/2006/wordml" xmlns:wps="http://schemas.microsoft.com/office/word/2010/wordprocessingShape" mc:Ignorable="w14 w15 w16se w16cid w16 w16cex w16sdtdh w16sdtfl w16du wp14">
   <w:abstractNum w:abstractNumId="0" w15:restartNumberingAfterBreak="0">
+    <w:nsid w:val="0FA72E51"/>
+    <w:multiLevelType w:val="hybridMultilevel"/>
+    <w:tmpl w:val="BFA6EDBC"/>
+    <w:lvl w:ilvl="0" w:tplc="5D004086">
+      <w:start w:val="1"/>
+      <w:numFmt w:val="decimal"/>
+      <w:lvlText w:val="%1."/>
+      <w:lvlJc w:val="left"/>
+      <w:pPr>
+        <w:ind w:left="720" w:hanging="360"/>
+      </w:pPr>
+    </w:lvl>
+    <w:lvl w:ilvl="1" w:tplc="0C0A0019" w:tentative="1">
+      <w:start w:val="1"/>
+      <w:numFmt w:val="lowerLetter"/>
+      <w:lvlText w:val="%2."/>
+      <w:lvlJc w:val="left"/>
+      <w:pPr>
+        <w:ind w:left="1440" w:hanging="360"/>
+      </w:pPr>
+    </w:lvl>
+    <w:lvl w:ilvl="2" w:tplc="0C0A001B" w:tentative="1">
+      <w:start w:val="1"/>
+      <w:numFmt w:val="lowerRoman"/>
+      <w:lvlText w:val="%3."/>
+      <w:lvlJc w:val="right"/>
+      <w:pPr>
+        <w:ind w:left="2160" w:hanging="180"/>
+      </w:pPr>
+    </w:lvl>
+    <w:lvl w:ilvl="3" w:tplc="0C0A000F" w:tentative="1">
+      <w:start w:val="1"/>
+      <w:numFmt w:val="decimal"/>
+      <w:lvlText w:val="%4."/>
+      <w:lvlJc w:val="left"/>
+      <w:pPr>
+        <w:ind w:left="2880" w:hanging="360"/>
+      </w:pPr>
+    </w:lvl>
+    <w:lvl w:ilvl="4" w:tplc="0C0A0019" w:tentative="1">
+      <w:start w:val="1"/>
+      <w:numFmt w:val="lowerLetter"/>
+      <w:lvlText w:val="%5."/>
+      <w:lvlJc w:val="left"/>
+      <w:pPr>
+        <w:ind w:left="3600" w:hanging="360"/>
+      </w:pPr>
+    </w:lvl>
+    <w:lvl w:ilvl="5" w:tplc="0C0A001B" w:tentative="1">
+      <w:start w:val="1"/>
+      <w:numFmt w:val="lowerRoman"/>
+      <w:lvlText w:val="%6."/>
+      <w:lvlJc w:val="right"/>
+      <w:pPr>
+        <w:ind w:left="4320" w:hanging="180"/>
+      </w:pPr>
+    </w:lvl>
+    <w:lvl w:ilvl="6" w:tplc="0C0A000F" w:tentative="1">
+      <w:start w:val="1"/>
+      <w:numFmt w:val="decimal"/>
+      <w:lvlText w:val="%7."/>
+      <w:lvlJc w:val="left"/>
+      <w:pPr>
+        <w:ind w:left="5040" w:hanging="360"/>
+      </w:pPr>
+    </w:lvl>
+    <w:lvl w:ilvl="7" w:tplc="0C0A0019" w:tentative="1">
+      <w:start w:val="1"/>
+      <w:numFmt w:val="lowerLetter"/>
+      <w:lvlText w:val="%8."/>
+      <w:lvlJc w:val="left"/>
+      <w:pPr>
+        <w:ind w:left="5760" w:hanging="360"/>
+      </w:pPr>
+    </w:lvl>
+    <w:lvl w:ilvl="8" w:tplc="0C0A001B" w:tentative="1">
+      <w:start w:val="1"/>
+      <w:numFmt w:val="lowerRoman"/>
+      <w:lvlText w:val="%9."/>
+      <w:lvlJc w:val="right"/>
+      <w:pPr>
+        <w:ind w:left="6480" w:hanging="180"/>
+      </w:pPr>
+    </w:lvl>
+  </w:abstractNum>
+  <w:abstractNum w:abstractNumId="1" w15:restartNumberingAfterBreak="0">
     <w:nsid w:val="1E792EE9"/>
     <w:multiLevelType w:val="multilevel"/>
     <w:tmpl w:val="C2EC653C"/>
@@ -1902,8 +2232,225 @@
       </w:rPr>
     </w:lvl>
   </w:abstractNum>
+  <w:abstractNum w:abstractNumId="2" w15:restartNumberingAfterBreak="0">
+    <w:nsid w:val="4EC341FD"/>
+    <w:multiLevelType w:val="multilevel"/>
+    <w:tmpl w:val="3720298C"/>
+    <w:lvl w:ilvl="0">
+      <w:start w:val="1"/>
+      <w:numFmt w:val="upperLetter"/>
+      <w:pStyle w:val="Ttulo1"/>
+      <w:suff w:val="space"/>
+      <w:lvlText w:val="%1."/>
+      <w:lvlJc w:val="left"/>
+      <w:pPr>
+        <w:ind w:left="0" w:firstLine="0"/>
+      </w:pPr>
+      <w:rPr>
+        <w:rFonts w:hint="default"/>
+      </w:rPr>
+    </w:lvl>
+    <w:lvl w:ilvl="1">
+      <w:start w:val="1"/>
+      <w:numFmt w:val="decimal"/>
+      <w:pStyle w:val="Ttulo2"/>
+      <w:suff w:val="space"/>
+      <w:lvlText w:val="%2."/>
+      <w:lvlJc w:val="left"/>
+      <w:pPr>
+        <w:ind w:left="0" w:firstLine="0"/>
+      </w:pPr>
+      <w:rPr>
+        <w:rFonts w:hint="default"/>
+      </w:rPr>
+    </w:lvl>
+    <w:lvl w:ilvl="2">
+      <w:start w:val="1"/>
+      <w:numFmt w:val="lowerLetter"/>
+      <w:pStyle w:val="Ttulo3"/>
+      <w:suff w:val="space"/>
+      <w:lvlText w:val="%3."/>
+      <w:lvlJc w:val="right"/>
+      <w:pPr>
+        <w:ind w:left="0" w:firstLine="0"/>
+      </w:pPr>
+      <w:rPr>
+        <w:rFonts w:hint="default"/>
+      </w:rPr>
+    </w:lvl>
+    <w:lvl w:ilvl="3">
+      <w:start w:val="1"/>
+      <w:numFmt w:val="decimal"/>
+      <w:lvlText w:val="%4."/>
+      <w:lvlJc w:val="left"/>
+      <w:pPr>
+        <w:ind w:left="0" w:firstLine="0"/>
+      </w:pPr>
+      <w:rPr>
+        <w:rFonts w:hint="default"/>
+      </w:rPr>
+    </w:lvl>
+    <w:lvl w:ilvl="4">
+      <w:start w:val="1"/>
+      <w:numFmt w:val="lowerLetter"/>
+      <w:lvlText w:val="%5."/>
+      <w:lvlJc w:val="left"/>
+      <w:pPr>
+        <w:ind w:left="0" w:firstLine="0"/>
+      </w:pPr>
+      <w:rPr>
+        <w:rFonts w:hint="default"/>
+      </w:rPr>
+    </w:lvl>
+    <w:lvl w:ilvl="5">
+      <w:start w:val="1"/>
+      <w:numFmt w:val="lowerRoman"/>
+      <w:lvlText w:val="%6."/>
+      <w:lvlJc w:val="right"/>
+      <w:pPr>
+        <w:ind w:left="0" w:firstLine="0"/>
+      </w:pPr>
+      <w:rPr>
+        <w:rFonts w:hint="default"/>
+      </w:rPr>
+    </w:lvl>
+    <w:lvl w:ilvl="6">
+      <w:start w:val="1"/>
+      <w:numFmt w:val="decimal"/>
+      <w:lvlText w:val="%7."/>
+      <w:lvlJc w:val="left"/>
+      <w:pPr>
+        <w:ind w:left="0" w:firstLine="0"/>
+      </w:pPr>
+      <w:rPr>
+        <w:rFonts w:hint="default"/>
+      </w:rPr>
+    </w:lvl>
+    <w:lvl w:ilvl="7">
+      <w:start w:val="1"/>
+      <w:numFmt w:val="lowerLetter"/>
+      <w:lvlText w:val="%8."/>
+      <w:lvlJc w:val="left"/>
+      <w:pPr>
+        <w:ind w:left="0" w:firstLine="0"/>
+      </w:pPr>
+      <w:rPr>
+        <w:rFonts w:hint="default"/>
+      </w:rPr>
+    </w:lvl>
+    <w:lvl w:ilvl="8">
+      <w:start w:val="1"/>
+      <w:numFmt w:val="lowerRoman"/>
+      <w:lvlText w:val="%9."/>
+      <w:lvlJc w:val="right"/>
+      <w:pPr>
+        <w:ind w:left="0" w:firstLine="0"/>
+      </w:pPr>
+      <w:rPr>
+        <w:rFonts w:hint="default"/>
+      </w:rPr>
+    </w:lvl>
+  </w:abstractNum>
+  <w:abstractNum w:abstractNumId="3" w15:restartNumberingAfterBreak="0">
+    <w:nsid w:val="51225777"/>
+    <w:multiLevelType w:val="hybridMultilevel"/>
+    <w:tmpl w:val="39D02898"/>
+    <w:lvl w:ilvl="0" w:tplc="1002637A">
+      <w:start w:val="1"/>
+      <w:numFmt w:val="upperLetter"/>
+      <w:lvlText w:val="%1."/>
+      <w:lvlJc w:val="left"/>
+      <w:pPr>
+        <w:ind w:left="720" w:hanging="360"/>
+      </w:pPr>
+    </w:lvl>
+    <w:lvl w:ilvl="1" w:tplc="0C0A0019" w:tentative="1">
+      <w:start w:val="1"/>
+      <w:numFmt w:val="lowerLetter"/>
+      <w:lvlText w:val="%2."/>
+      <w:lvlJc w:val="left"/>
+      <w:pPr>
+        <w:ind w:left="1440" w:hanging="360"/>
+      </w:pPr>
+    </w:lvl>
+    <w:lvl w:ilvl="2" w:tplc="0C0A001B" w:tentative="1">
+      <w:start w:val="1"/>
+      <w:numFmt w:val="lowerRoman"/>
+      <w:lvlText w:val="%3."/>
+      <w:lvlJc w:val="right"/>
+      <w:pPr>
+        <w:ind w:left="2160" w:hanging="180"/>
+      </w:pPr>
+    </w:lvl>
+    <w:lvl w:ilvl="3" w:tplc="0C0A000F" w:tentative="1">
+      <w:start w:val="1"/>
+      <w:numFmt w:val="decimal"/>
+      <w:lvlText w:val="%4."/>
+      <w:lvlJc w:val="left"/>
+      <w:pPr>
+        <w:ind w:left="2880" w:hanging="360"/>
+      </w:pPr>
+    </w:lvl>
+    <w:lvl w:ilvl="4" w:tplc="0C0A0019" w:tentative="1">
+      <w:start w:val="1"/>
+      <w:numFmt w:val="lowerLetter"/>
+      <w:lvlText w:val="%5."/>
+      <w:lvlJc w:val="left"/>
+      <w:pPr>
+        <w:ind w:left="3600" w:hanging="360"/>
+      </w:pPr>
+    </w:lvl>
+    <w:lvl w:ilvl="5" w:tplc="0C0A001B" w:tentative="1">
+      <w:start w:val="1"/>
+      <w:numFmt w:val="lowerRoman"/>
+      <w:lvlText w:val="%6."/>
+      <w:lvlJc w:val="right"/>
+      <w:pPr>
+        <w:ind w:left="4320" w:hanging="180"/>
+      </w:pPr>
+    </w:lvl>
+    <w:lvl w:ilvl="6" w:tplc="0C0A000F" w:tentative="1">
+      <w:start w:val="1"/>
+      <w:numFmt w:val="decimal"/>
+      <w:lvlText w:val="%7."/>
+      <w:lvlJc w:val="left"/>
+      <w:pPr>
+        <w:ind w:left="5040" w:hanging="360"/>
+      </w:pPr>
+    </w:lvl>
+    <w:lvl w:ilvl="7" w:tplc="0C0A0019" w:tentative="1">
+      <w:start w:val="1"/>
+      <w:numFmt w:val="lowerLetter"/>
+      <w:lvlText w:val="%8."/>
+      <w:lvlJc w:val="left"/>
+      <w:pPr>
+        <w:ind w:left="5760" w:hanging="360"/>
+      </w:pPr>
+    </w:lvl>
+    <w:lvl w:ilvl="8" w:tplc="0C0A001B" w:tentative="1">
+      <w:start w:val="1"/>
+      <w:numFmt w:val="lowerRoman"/>
+      <w:lvlText w:val="%9."/>
+      <w:lvlJc w:val="right"/>
+      <w:pPr>
+        <w:ind w:left="6480" w:hanging="180"/>
+      </w:pPr>
+    </w:lvl>
+  </w:abstractNum>
   <w:num w:numId="1" w16cid:durableId="572589086">
+    <w:abstractNumId w:val="1"/>
+  </w:num>
+  <w:num w:numId="2" w16cid:durableId="1942101102">
+    <w:abstractNumId w:val="3"/>
+  </w:num>
+  <w:num w:numId="3" w16cid:durableId="1929191896">
     <w:abstractNumId w:val="0"/>
+  </w:num>
+  <w:num w:numId="4" w16cid:durableId="544874743">
+    <w:abstractNumId w:val="2"/>
+  </w:num>
+  <w:num w:numId="5" w16cid:durableId="2005815061">
+    <w:abstractNumId w:val="2"/>
   </w:num>
 </w:numbering>
 </file>
@@ -2325,15 +2872,17 @@
     <w:link w:val="Ttulo1Car"/>
     <w:uiPriority w:val="9"/>
     <w:qFormat/>
-    <w:rsid w:val="00C23674"/>
+    <w:rsid w:val="00E15CD6"/>
     <w:pPr>
       <w:keepNext/>
       <w:keepLines/>
+      <w:numPr>
+        <w:numId w:val="4"/>
+      </w:numPr>
       <w:pBdr>
         <w:bottom w:val="single" w:sz="8" w:space="1" w:color="4C94D8" w:themeColor="text2" w:themeTint="80"/>
       </w:pBdr>
       <w:spacing w:before="360" w:after="80"/>
-      <w:ind w:left="0"/>
       <w:outlineLvl w:val="0"/>
     </w:pPr>
     <w:rPr>
@@ -2356,11 +2905,14 @@
     <w:pPr>
       <w:keepNext/>
       <w:keepLines/>
+      <w:numPr>
+        <w:ilvl w:val="1"/>
+        <w:numId w:val="4"/>
+      </w:numPr>
       <w:pBdr>
         <w:bottom w:val="single" w:sz="4" w:space="1" w:color="4C94D8" w:themeColor="text2" w:themeTint="80"/>
       </w:pBdr>
       <w:spacing w:after="80"/>
-      <w:ind w:left="0"/>
       <w:outlineLvl w:val="1"/>
     </w:pPr>
     <w:rPr>
@@ -2379,17 +2931,23 @@
     <w:uiPriority w:val="9"/>
     <w:unhideWhenUsed/>
     <w:qFormat/>
-    <w:rsid w:val="00C23674"/>
+    <w:rsid w:val="00D93320"/>
     <w:pPr>
       <w:keepNext/>
       <w:keepLines/>
+      <w:numPr>
+        <w:ilvl w:val="2"/>
+        <w:numId w:val="4"/>
+      </w:numPr>
       <w:spacing w:after="80"/>
+      <w:ind w:left="708"/>
       <w:outlineLvl w:val="2"/>
     </w:pPr>
     <w:rPr>
       <w:rFonts w:eastAsiaTheme="majorEastAsia" w:cstheme="majorBidi"/>
       <w:b/>
       <w:szCs w:val="28"/>
+      <w:u w:val="single"/>
     </w:rPr>
   </w:style>
   <w:style w:type="paragraph" w:styleId="Ttulo4">
@@ -2583,12 +3141,13 @@
     <w:basedOn w:val="Fuentedeprrafopredeter"/>
     <w:link w:val="Ttulo3"/>
     <w:uiPriority w:val="9"/>
-    <w:rsid w:val="00C23674"/>
+    <w:rsid w:val="00D93320"/>
     <w:rPr>
       <w:rFonts w:ascii="Arial" w:eastAsiaTheme="majorEastAsia" w:hAnsi="Arial" w:cstheme="majorBidi"/>
       <w:b/>
       <w:sz w:val="20"/>
       <w:szCs w:val="28"/>
+      <w:u w:val="single"/>
     </w:rPr>
   </w:style>
   <w:style w:type="character" w:customStyle="1" w:styleId="Ttulo4Car">

</xml_diff>